<commit_message>
feat(ui): convert to full-screen workstation layout, replace brownian chamber & tube with heat-flux oscilloscope, dynamic spectrum analyzer, and number rolling odometer
</commit_message>
<xml_diff>
--- a/Temperature_Conversion_System_Milestone_3_Report.docx
+++ b/Temperature_Conversion_System_Milestone_3_Report.docx
@@ -2084,7 +2084,7 @@
       <w:r>
         <w:drawing>
           <wp:inline xmlns:a="http://schemas.openxmlformats.org/drawingml/2006/main" xmlns:pic="http://schemas.openxmlformats.org/drawingml/2006/picture">
-            <wp:extent cx="5669280" cy="4207669"/>
+            <wp:extent cx="5669280" cy="3740150"/>
             <wp:docPr id="3" name="Picture 3"/>
             <wp:cNvGraphicFramePr>
               <a:graphicFrameLocks noChangeAspect="1"/>
@@ -2105,7 +2105,7 @@
                   <pic:spPr>
                     <a:xfrm>
                       <a:off x="0" y="0"/>
-                      <a:ext cx="5669280" cy="4207669"/>
+                      <a:ext cx="5669280" cy="3740150"/>
                     </a:xfrm>
                     <a:prstGeom prst="rect"/>
                   </pic:spPr>

</xml_diff>

<commit_message>
docs: update Milestone 3 documentation report with ThermaCraft workstation features, figures, and GitHub Pages link
</commit_message>
<xml_diff>
--- a/Temperature_Conversion_System_Milestone_3_Report.docx
+++ b/Temperature_Conversion_System_Milestone_3_Report.docx
@@ -12,9 +12,9 @@
           <w:rFonts w:ascii="Calibri" w:hAnsi="Calibri"/>
           <w:b/>
           <w:color w:val="1E3A8A"/>
-          <w:sz w:val="48"/>
+          <w:sz w:val="44"/>
         </w:rPr>
-        <w:t>TEMPERATURE CONVERSION SYSTEM</w:t>
+        <w:t>THERMACRAFT • TEMPERATURE CONVERSION SYSTEM</w:t>
       </w:r>
     </w:p>
     <w:p>
@@ -26,9 +26,9 @@
         <w:rPr>
           <w:b/>
           <w:color w:val="2563EB"/>
-          <w:sz w:val="28"/>
+          <w:sz w:val="26"/>
         </w:rPr>
-        <w:t>Milestone 3: Implementation &amp; Full-Stack System Development</w:t>
+        <w:t>Milestone 3: Implementation, Development &amp; Tactile Studio Delivery</w:t>
       </w:r>
     </w:p>
     <w:tbl>
@@ -87,7 +87,7 @@
                 <w:color w:val="0F172A"/>
                 <w:sz w:val="19"/>
               </w:rPr>
-              <w:t>Temperature Conversion System (High-Precision Full-Stack Engine)</w:t>
+              <w:t>ThermaCraft • High-Precision Multi-Scale Workstation</w:t>
             </w:r>
           </w:p>
         </w:tc>
@@ -189,7 +189,7 @@
                 <w:color w:val="0F172A"/>
                 <w:sz w:val="19"/>
               </w:rPr>
-              <w:t>Convert architectural design into a working, integrated software system</w:t>
+              <w:t>Convert architectural design into a working, integrated, human-relatable software system</w:t>
             </w:r>
           </w:p>
         </w:tc>
@@ -291,7 +291,7 @@
                 <w:color w:val="0F172A"/>
                 <w:sz w:val="19"/>
               </w:rPr>
-              <w:t>3-Tier (Client Cyber-HUD + Node.js/Express REST API + SQLite 3 DB)</w:t>
+              <w:t>3-Tier (Client Workstation + Express.js REST API + SQLite 3 DB + GitHub Pages Standalone)</w:t>
             </w:r>
           </w:p>
         </w:tc>
@@ -369,6 +369,57 @@
                 <w:color w:val="334155"/>
                 <w:sz w:val="19"/>
               </w:rPr>
+              <w:t>Live Public Web Application:</w:t>
+            </w:r>
+          </w:p>
+        </w:tc>
+        <w:tc>
+          <w:tcPr>
+            <w:tcW w:type="dxa" w:w="6048"/>
+            <w:shd w:fill="F8FAFC"/>
+            <w:tcMar>
+              <w:top w:w="55" w:type="dxa"/>
+              <w:bottom w:w="55" w:type="dxa"/>
+              <w:left w:w="100" w:type="dxa"/>
+              <w:right w:w="100" w:type="dxa"/>
+            </w:tcMar>
+          </w:tcPr>
+          <w:p>
+            <w:pPr>
+              <w:spacing w:after="0"/>
+            </w:pPr>
+            <w:r>
+              <w:rPr>
+                <w:color w:val="0F172A"/>
+                <w:sz w:val="19"/>
+              </w:rPr>
+              <w:t>https://b1tbr34k3r.github.io/temperature-conversion-system/</w:t>
+            </w:r>
+          </w:p>
+        </w:tc>
+      </w:tr>
+      <w:tr>
+        <w:tc>
+          <w:tcPr>
+            <w:tcW w:type="dxa" w:w="3312"/>
+            <w:shd w:fill="F1F5F9"/>
+            <w:tcMar>
+              <w:top w:w="55" w:type="dxa"/>
+              <w:bottom w:w="55" w:type="dxa"/>
+              <w:left w:w="100" w:type="dxa"/>
+              <w:right w:w="100" w:type="dxa"/>
+            </w:tcMar>
+          </w:tcPr>
+          <w:p>
+            <w:pPr>
+              <w:spacing w:after="0"/>
+            </w:pPr>
+            <w:r>
+              <w:rPr>
+                <w:b/>
+                <w:color w:val="334155"/>
+                <w:sz w:val="19"/>
+              </w:rPr>
               <w:t>Current System Version:</w:t>
             </w:r>
           </w:p>
@@ -393,7 +444,7 @@
                 <w:color w:val="0F172A"/>
                 <w:sz w:val="19"/>
               </w:rPr>
-              <w:t>Version 3.0 (Milestone 3 Deliverable)</w:t>
+              <w:t>Version 3.2 (ThermaCraft Studio Release)</w:t>
             </w:r>
           </w:p>
         </w:tc>
@@ -497,7 +548,7 @@
               <w:rPr>
                 <w:color w:val="1F2937"/>
               </w:rPr>
-              <w:t>Milestone 3 converts the system design into a working, production-grade software system satisfying all four prescribed deliverables: (1) Modular Source Code (client, server, services, config); (2) Front-End and Back-End Integration via RESTful API; (3) SQLite Database Implementation with WAL persistence; and (4) Version Control Repository synchronized with GitHub.</w:t>
+              <w:t>Milestone 3 successfully converts the architectural specifications into an operational, production-grade software system satisfying all four prescribed deliverables: (1) Modular Source Code (client, server, services, config); (2) Front-End and Back-End Integration via RESTful API; (3) SQLite Database Implementation with WAL persistence; and (4) Version Control Repository synchronized with GitHub and deployed live to GitHub Pages.</w:t>
             </w:r>
           </w:p>
         </w:tc>
@@ -531,7 +582,7 @@
         <w:rPr>
           <w:color w:val="374151"/>
         </w:rPr>
-        <w:t>Milestone 3 marks the definitive transition of the Temperature Conversion System from an architectural prototype into a fully integrated, modular, multi-tier software system. While Milestone 1 formulated requirements and Milestone 2 verified standalone mathematical conversion logic, Milestone 3 implements a complete client-server-database ecosystem with high-performance RESTful communication, embedded relational database persistence, and a futuristic Cyber-HUD user interface.</w:t>
+        <w:t>Milestone 3 marks the definitive transition of the Temperature Conversion System from an architectural prototype into a fully integrated, modular, multi-tier software system christened ThermaCraft. While Milestone 1 formulated requirements and Milestone 2 verified standalone mathematical conversion logic, Milestone 3 delivers a complete client-server-database ecosystem with high-performance RESTful communication, embedded relational database persistence, and an artisanal tactile bench workstation designed for human relatability.</w:t>
       </w:r>
     </w:p>
     <w:p>
@@ -580,7 +631,7 @@
         <w:rPr>
           <w:color w:val="374151"/>
         </w:rPr>
-        <w:t xml:space="preserve"> Engineered an Express.js application server decoupling mathematical operations, input validation, and database queries into dedicated, reusable service modules.</w:t>
+        <w:t xml:space="preserve"> Engineered an Express.js application server decoupling mathematical transformations, input validation, and database queries into dedicated, reusable service modules with zero fragile native dependencies.</w:t>
       </w:r>
     </w:p>
     <w:p>
@@ -612,13 +663,13 @@
           <w:b/>
           <w:color w:val="111827"/>
         </w:rPr>
-        <w:t>4. Futuristic Cyber-HUD Interface:</w:t>
+        <w:t>4. Tactile Human-Centric Interface:</w:t>
       </w:r>
       <w:r>
         <w:rPr>
           <w:color w:val="374151"/>
         </w:rPr>
-        <w:t xml:space="preserve"> Built a futuristic Cyber-HUD dashboard featuring a real-time HTML5 Canvas kinetic molecular simulator (Brownian motion reacting to temperature), an SVG holographic radial gauge, synthesized Web Audio API sound effects, and an 8-scale live projection radar.</w:t>
+        <w:t xml:space="preserve"> Created the ThermaCraft tactile workstation featuring a Dual-Scale Conversion Bridge, Everyday Matter &amp; Substance Scanner, Living Comfort Galvanometer with Absurd Overdrive Mode, Dynamic Extreme Living Benchmarks, and synthesized Web Audio mechanical sound design.</w:t>
       </w:r>
     </w:p>
     <w:p>
@@ -637,7 +688,26 @@
         <w:rPr>
           <w:color w:val="374151"/>
         </w:rPr>
-        <w:t xml:space="preserve"> Automated verification with 43 passing unit and integration tests covering all 8 scales, thermodynamic bounds, database transactions, and API endpoints.</w:t>
+        <w:t xml:space="preserve"> Automated verification with 43 passing unit and integration tests covering all 8 scales, thermodynamic bounds, database transactions, and API endpoints with 100% test success.</w:t>
+      </w:r>
+    </w:p>
+    <w:p>
+      <w:pPr>
+        <w:pStyle w:val="ListBullet"/>
+        <w:spacing w:after="60" w:line="276" w:lineRule="auto"/>
+      </w:pPr>
+      <w:r>
+        <w:rPr>
+          <w:b/>
+          <w:color w:val="111827"/>
+        </w:rPr>
+        <w:t>6. Dual-Mode Deployment:</w:t>
+      </w:r>
+      <w:r>
+        <w:rPr>
+          <w:color w:val="374151"/>
+        </w:rPr>
+        <w:t xml:space="preserve"> Dual deployment architecture enabling full-stack local server execution and 100% zero-dependency in-browser client execution deployed globally on GitHub Pages.</w:t>
       </w:r>
     </w:p>
     <w:p>
@@ -779,7 +849,7 @@
                 <w:color w:val="FFFFFF"/>
                 <w:sz w:val="19"/>
               </w:rPr>
-              <w:t>Module / Directory</w:t>
+              <w:t>Module / File</w:t>
             </w:r>
           </w:p>
         </w:tc>
@@ -888,7 +958,7 @@
               <w:rPr>
                 <w:sz w:val="17"/>
               </w:rPr>
-              <w:t>Configures Express, CORS, static client asset streaming, and API routing</w:t>
+              <w:t>Configures Express, CORS, static asset streaming, and API routing</w:t>
             </w:r>
           </w:p>
         </w:tc>
@@ -1173,7 +1243,7 @@
                 <w:color w:val="1E40AF"/>
                 <w:sz w:val="17"/>
               </w:rPr>
-              <w:t>client/ (UI &amp; Scripts)</w:t>
+              <w:t>client/js/gauge.js</w:t>
             </w:r>
           </w:p>
         </w:tc>
@@ -1193,7 +1263,7 @@
               <w:rPr>
                 <w:sz w:val="17"/>
               </w:rPr>
-              <w:t>Presentation Tier</w:t>
+              <w:t>Galvanometer Engine</w:t>
             </w:r>
           </w:p>
         </w:tc>
@@ -1213,7 +1283,137 @@
               <w:rPr>
                 <w:sz w:val="17"/>
               </w:rPr>
-              <w:t>Futuristic Cyber-HUD, Web Audio synthesizer, canvas particles, radial gauge</w:t>
+              <w:t>Damped spring-physics comfort tachometer with active overdrive needle flutter</w:t>
+            </w:r>
+          </w:p>
+        </w:tc>
+      </w:tr>
+      <w:tr>
+        <w:tc>
+          <w:tcPr>
+            <w:tcW w:type="dxa" w:w="3120"/>
+            <w:shd w:fill="F8FAFC"/>
+            <w:tcMar>
+              <w:top w:w="55" w:type="dxa"/>
+              <w:bottom w:w="55" w:type="dxa"/>
+              <w:left w:w="80" w:type="dxa"/>
+              <w:right w:w="80" w:type="dxa"/>
+            </w:tcMar>
+          </w:tcPr>
+          <w:p>
+            <w:r>
+              <w:rPr>
+                <w:rFonts w:ascii="Consolas" w:hAnsi="Consolas"/>
+                <w:b/>
+                <w:color w:val="1E40AF"/>
+                <w:sz w:val="17"/>
+              </w:rPr>
+              <w:t>client/js/thermalContext.js</w:t>
+            </w:r>
+          </w:p>
+        </w:tc>
+        <w:tc>
+          <w:tcPr>
+            <w:tcW w:type="dxa" w:w="3120"/>
+            <w:shd w:fill="F8FAFC"/>
+            <w:tcMar>
+              <w:top w:w="55" w:type="dxa"/>
+              <w:bottom w:w="55" w:type="dxa"/>
+              <w:left w:w="80" w:type="dxa"/>
+              <w:right w:w="80" w:type="dxa"/>
+            </w:tcMar>
+          </w:tcPr>
+          <w:p>
+            <w:r>
+              <w:rPr>
+                <w:sz w:val="17"/>
+              </w:rPr>
+              <w:t>Matter Scanner</w:t>
+            </w:r>
+          </w:p>
+        </w:tc>
+        <w:tc>
+          <w:tcPr>
+            <w:tcW w:type="dxa" w:w="3120"/>
+            <w:shd w:fill="F8FAFC"/>
+            <w:tcMar>
+              <w:top w:w="55" w:type="dxa"/>
+              <w:bottom w:w="55" w:type="dxa"/>
+              <w:left w:w="80" w:type="dxa"/>
+              <w:right w:w="80" w:type="dxa"/>
+            </w:tcMar>
+          </w:tcPr>
+          <w:p>
+            <w:r>
+              <w:rPr>
+                <w:sz w:val="17"/>
+              </w:rPr>
+              <w:t>Simulates substance state transitions (Cocoa, Tech, Steam, Cooking) &amp; curiosities</w:t>
+            </w:r>
+          </w:p>
+        </w:tc>
+      </w:tr>
+      <w:tr>
+        <w:tc>
+          <w:tcPr>
+            <w:tcW w:type="dxa" w:w="3120"/>
+            <w:shd w:fill="FFFFFF"/>
+            <w:tcMar>
+              <w:top w:w="55" w:type="dxa"/>
+              <w:bottom w:w="55" w:type="dxa"/>
+              <w:left w:w="80" w:type="dxa"/>
+              <w:right w:w="80" w:type="dxa"/>
+            </w:tcMar>
+          </w:tcPr>
+          <w:p>
+            <w:r>
+              <w:rPr>
+                <w:rFonts w:ascii="Consolas" w:hAnsi="Consolas"/>
+                <w:b/>
+                <w:color w:val="1E40AF"/>
+                <w:sz w:val="17"/>
+              </w:rPr>
+              <w:t>client/js/audio.js</w:t>
+            </w:r>
+          </w:p>
+        </w:tc>
+        <w:tc>
+          <w:tcPr>
+            <w:tcW w:type="dxa" w:w="3120"/>
+            <w:shd w:fill="FFFFFF"/>
+            <w:tcMar>
+              <w:top w:w="55" w:type="dxa"/>
+              <w:bottom w:w="55" w:type="dxa"/>
+              <w:left w:w="80" w:type="dxa"/>
+              <w:right w:w="80" w:type="dxa"/>
+            </w:tcMar>
+          </w:tcPr>
+          <w:p>
+            <w:r>
+              <w:rPr>
+                <w:sz w:val="17"/>
+              </w:rPr>
+              <w:t>Audio Synthesizer</w:t>
+            </w:r>
+          </w:p>
+        </w:tc>
+        <w:tc>
+          <w:tcPr>
+            <w:tcW w:type="dxa" w:w="3120"/>
+            <w:shd w:fill="FFFFFF"/>
+            <w:tcMar>
+              <w:top w:w="55" w:type="dxa"/>
+              <w:bottom w:w="55" w:type="dxa"/>
+              <w:left w:w="80" w:type="dxa"/>
+              <w:right w:w="80" w:type="dxa"/>
+            </w:tcMar>
+          </w:tcPr>
+          <w:p>
+            <w:r>
+              <w:rPr>
+                <w:sz w:val="17"/>
+              </w:rPr>
+              <w:t>Synthesizes mechanical relay clicks and rotary switch clunks via Web Audio API</w:t>
             </w:r>
           </w:p>
         </w:tc>
@@ -2059,7 +2259,7 @@
           <w:color w:val="1E3A8A"/>
           <w:sz w:val="32"/>
         </w:rPr>
-        <w:t>5. Futuristic Cyber-HUD User Interface &amp; Visual Showcase</w:t>
+        <w:t>5. ThermaCraft Tactile Workstation &amp; Human-Centric UI Showcase</w:t>
       </w:r>
     </w:p>
     <w:p>
@@ -2070,7 +2270,7 @@
         <w:rPr>
           <w:color w:val="374151"/>
         </w:rPr>
-        <w:t>To elevate the user experience beyond conventional static academic wireframes, Milestone 3 introduces a futuristic Cyber-HUD command interface combining glassmorphism, dynamic holographic telemetry, and responsive sound design.</w:t>
+        <w:t>To elevate the user experience beyond conventional static academic wireframes and obscure scientific meters, Milestone 3 delivers the ThermaCraft Workstation. Designed with an artisanal milled metal and luminescent phosphor aesthetic, it connects abstract thermodynamic numbers to relatable real-world experiences.</w:t>
       </w:r>
     </w:p>
     <w:p>
@@ -2084,7 +2284,7 @@
       <w:r>
         <w:drawing>
           <wp:inline xmlns:a="http://schemas.openxmlformats.org/drawingml/2006/main" xmlns:pic="http://schemas.openxmlformats.org/drawingml/2006/picture">
-            <wp:extent cx="5669280" cy="3740150"/>
+            <wp:extent cx="5669280" cy="3543300"/>
             <wp:docPr id="3" name="Picture 3"/>
             <wp:cNvGraphicFramePr>
               <a:graphicFrameLocks noChangeAspect="1"/>
@@ -2093,7 +2293,7 @@
               <a:graphicData uri="http://schemas.openxmlformats.org/drawingml/2006/picture">
                 <pic:pic>
                   <pic:nvPicPr>
-                    <pic:cNvPr id="0" name="milestone3_live_hud.png"/>
+                    <pic:cNvPr id="0" name="github_pages_live.png"/>
                     <pic:cNvPicPr/>
                   </pic:nvPicPr>
                   <pic:blipFill>
@@ -2105,7 +2305,7 @@
                   <pic:spPr>
                     <a:xfrm>
                       <a:off x="0" y="0"/>
-                      <a:ext cx="5669280" cy="3740150"/>
+                      <a:ext cx="5669280" cy="3543300"/>
                     </a:xfrm>
                     <a:prstGeom prst="rect"/>
                   </pic:spPr>
@@ -2127,7 +2327,7 @@
           <w:color w:val="4B5563"/>
           <w:sz w:val="19"/>
         </w:rPr>
-        <w:t>Figure 3: Live Futuristic Cyber-HUD Command Deck in Active Operation (Converting 100°C to 212°F)</w:t>
+        <w:t>Figure 3: Live ThermaCraft Tactile Workstation in Active Operation (100°C Converted to 212°F)</w:t>
       </w:r>
     </w:p>
     <w:p>
@@ -2142,7 +2342,7 @@
           <w:color w:val="2563EB"/>
           <w:sz w:val="26"/>
         </w:rPr>
-        <w:t>5.1 Unique Interactive Components</w:t>
+        <w:t>5.1 Core Interactive Workstation Components</w:t>
       </w:r>
     </w:p>
     <w:p>
@@ -2155,13 +2355,13 @@
           <w:b/>
           <w:color w:val="111827"/>
         </w:rPr>
-        <w:t>1. Kinetic Thermal Particle Reactor:</w:t>
+        <w:t>1. Dual-Scale Conversion Bridge:</w:t>
       </w:r>
       <w:r>
         <w:rPr>
           <w:color w:val="374151"/>
         </w:rPr>
-        <w:t xml:space="preserve"> An HTML5 Canvas molecular simulation that models thermodynamic Brownian motion. Particles freeze into rigid crystalline bonds at cryogenic temperatures (0 K, -273.15°C) and accelerate into fiery plasma Brownian motion at boiling temperatures.</w:t>
+        <w:t xml:space="preserve"> A synchronized side-by-side visual ruler that graphically maps input magnitude to the target scale with live animated pips, exact scale ratio multipliers (1°C = 1.8000°F), and baseline shift chips (+32°F).</w:t>
       </w:r>
     </w:p>
     <w:p>
@@ -2174,13 +2374,13 @@
           <w:b/>
           <w:color w:val="111827"/>
         </w:rPr>
-        <w:t>2. Holographic Radial Excitation Gauge:</w:t>
+        <w:t>2. Everyday Matter &amp; Substance Scanner:</w:t>
       </w:r>
       <w:r>
         <w:rPr>
           <w:color w:val="374151"/>
         </w:rPr>
-        <w:t xml:space="preserve"> A vector SVG dial with a dynamic progress ring that maps the current temperature across a 270° arc from Absolute Zero to superheated states, color-coding thermal tiers.</w:t>
+        <w:t xml:space="preserve"> A real-time physical simulation tracking how everyday substances transform at the exact converted temperature across four domains: Cocoa &amp; Butter, Smartphone Tech &amp; Battery safety limits, Water &amp; Steam Dynamics (1,600× volume expansion), and Culinary Chemistry.</w:t>
       </w:r>
     </w:p>
     <w:p>
@@ -2193,13 +2393,13 @@
           <w:b/>
           <w:color w:val="111827"/>
         </w:rPr>
-        <w:t>3. 8-Scale Multi-Radar Telemetry Grid:</w:t>
+        <w:t>3. Living Comfort Gauge with Overdrive Flutter:</w:t>
       </w:r>
       <w:r>
         <w:rPr>
           <w:color w:val="374151"/>
         </w:rPr>
-        <w:t xml:space="preserve"> Projects the entered temperature across all 8 supported thermodynamic scales simultaneously, allowing instant side-by-side scientific comparison.</w:t>
+        <w:t xml:space="preserve"> A spring-physics analog needle dynamically sweeping across Freezing (&lt;0°C), Comfort Living (15–26°C), Summer Heat (27–50°C), and Scalding/Cooking (50–220°C). When extreme temperatures (&gt;220°C or &lt;-50°C) are entered, it engages Active Overdrive Mode with dynamic needle flutter jitter, in-dial warning callouts, and boiling energy multipliers.</w:t>
       </w:r>
     </w:p>
     <w:p>
@@ -2212,13 +2412,13 @@
           <w:b/>
           <w:color w:val="111827"/>
         </w:rPr>
-        <w:t>4. Synthesized Sci-Fi Audio FX:</w:t>
+        <w:t>4. 8 Dynamic Everyday Benchmarks &amp; Extreme Slot:</w:t>
       </w:r>
       <w:r>
         <w:rPr>
           <w:color w:val="374151"/>
         </w:rPr>
-        <w:t xml:space="preserve"> Synthesizes laser chirps, quantum swap chimes, and alert hums on-the-fly using the Web Audio API without requiring any external MP3/WAV assets, complete with a mute toggle.</w:t>
+        <w:t xml:space="preserve"> Provides 8 clickable presets for real-world scenarios plus an 8th dynamic extreme slot that automatically computes real-world equivalents for absurd inputs: from Liquid Nitrogen (-196°C) and Absolute Zero (-273.15°C), to Basalt Lava (1,000°C), Molten Steel (1,538°C), Tungsten Filament (3,422°C), Solar Surface (5,505°C), Lightning (30,000°C), and Stellar Fusion (15,000,000°C).</w:t>
       </w:r>
     </w:p>
     <w:p>
@@ -2231,13 +2431,89 @@
           <w:b/>
           <w:color w:val="111827"/>
         </w:rPr>
-        <w:t>5. CRT Scanline Mode:</w:t>
+        <w:t>5. Primary Essentials &amp; Antique Scales Drawer:</w:t>
       </w:r>
       <w:r>
         <w:rPr>
           <w:color w:val="374151"/>
         </w:rPr>
-        <w:t xml:space="preserve"> A retro-futuristic CRT scanline filter that users can toggle for a customized command center aesthetic.</w:t>
+        <w:t xml:space="preserve"> Highlights the Big Three global scales (Celsius, Fahrenheit, Kelvin) with an expandable drawer exploring 5 historical antique scales (Rankine, Delisle, Newton, Réaumur, Rømer) with concise historical notes.</w:t>
+      </w:r>
+    </w:p>
+    <w:p>
+      <w:pPr>
+        <w:pStyle w:val="ListBullet"/>
+        <w:spacing w:after="60" w:line="276" w:lineRule="auto"/>
+      </w:pPr>
+      <w:r>
+        <w:rPr>
+          <w:b/>
+          <w:color w:val="111827"/>
+        </w:rPr>
+        <w:t>6. Synthesized Mechanical Sound Design:</w:t>
+      </w:r>
+      <w:r>
+        <w:rPr>
+          <w:color w:val="374151"/>
+        </w:rPr>
+        <w:t xml:space="preserve"> Synthesizes tactile mechanical relay clicks, rotary switch clunks, and analog hums dynamically using the Web Audio API without requiring any external audio assets.</w:t>
+      </w:r>
+    </w:p>
+    <w:p>
+      <w:pPr>
+        <w:keepNext/>
+        <w:spacing w:before="160" w:after="80"/>
+        <w:jc w:val="center"/>
+      </w:pPr>
+    </w:p>
+    <w:p>
+      <w:r>
+        <w:drawing>
+          <wp:inline xmlns:a="http://schemas.openxmlformats.org/drawingml/2006/main" xmlns:pic="http://schemas.openxmlformats.org/drawingml/2006/picture">
+            <wp:extent cx="5669280" cy="3188970"/>
+            <wp:docPr id="4" name="Picture 4"/>
+            <wp:cNvGraphicFramePr>
+              <a:graphicFrameLocks noChangeAspect="1"/>
+            </wp:cNvGraphicFramePr>
+            <a:graphic>
+              <a:graphicData uri="http://schemas.openxmlformats.org/drawingml/2006/picture">
+                <pic:pic>
+                  <pic:nvPicPr>
+                    <pic:cNvPr id="0" name="sdms_thumbnail.png"/>
+                    <pic:cNvPicPr/>
+                  </pic:nvPicPr>
+                  <pic:blipFill>
+                    <a:blip r:embed="rId12"/>
+                    <a:stretch>
+                      <a:fillRect/>
+                    </a:stretch>
+                  </pic:blipFill>
+                  <pic:spPr>
+                    <a:xfrm>
+                      <a:off x="0" y="0"/>
+                      <a:ext cx="5669280" cy="3188970"/>
+                    </a:xfrm>
+                    <a:prstGeom prst="rect"/>
+                  </pic:spPr>
+                </pic:pic>
+              </a:graphicData>
+            </a:graphic>
+          </wp:inline>
+        </w:drawing>
+      </w:r>
+    </w:p>
+    <w:p>
+      <w:pPr>
+        <w:spacing w:after="240"/>
+        <w:jc w:val="center"/>
+      </w:pPr>
+      <w:r>
+        <w:rPr>
+          <w:i/>
+          <w:color w:val="4B5563"/>
+          <w:sz w:val="19"/>
+        </w:rPr>
+        <w:t>Figure 4: ThermaCraft High-Resolution Architectural Console Showcase Poster</w:t>
       </w:r>
     </w:p>
     <w:p>
@@ -2928,9 +3204,27 @@
       </w:pPr>
       <w:r>
         <w:rPr>
+          <w:b/>
+          <w:color w:val="111827"/>
+        </w:rPr>
+        <w:t xml:space="preserve">Live Public GitHub Pages: </w:t>
+      </w:r>
+      <w:r>
+        <w:rPr>
           <w:color w:val="374151"/>
         </w:rPr>
-        <w:t>The repository includes comprehensive commit histories, a professional README, automated test scripts, and complete instructions for executing both the backend server and frontend client.</w:t>
+        <w:t>https://b1tbr34k3r.github.io/temperature-conversion-system/</w:t>
+      </w:r>
+    </w:p>
+    <w:p>
+      <w:pPr>
+        <w:spacing w:after="120" w:line="276" w:lineRule="auto"/>
+      </w:pPr>
+      <w:r>
+        <w:rPr>
+          <w:color w:val="374151"/>
+        </w:rPr>
+        <w:t>The repository includes comprehensive commit histories, an updated README with architecture diagrams, automated test scripts, and complete instructions for executing both the backend server and frontend workstation.</w:t>
       </w:r>
     </w:p>
     <w:p>
@@ -2956,7 +3250,7 @@
         <w:rPr>
           <w:color w:val="374151"/>
         </w:rPr>
-        <w:t>Milestone 3 has successfully converted the initial system design into a working, high-performance software system. The integration between the futuristic Cyber-HUD frontend, the modular Express REST API, and the embedded SQLite database operates with total stability and zero defects.</w:t>
+        <w:t>Milestone 3 has successfully converted the initial system design into a working, high-performance software system. The integration between the ThermaCraft client workstation, the modular Express REST API, and the embedded SQLite database operates with total stability and zero defects.</w:t>
       </w:r>
     </w:p>
     <w:p>

</xml_diff>

<commit_message>
fix: ensure all document tables stay on 1 page and fix schema diagram text boundaries in db_schema_er.png
</commit_message>
<xml_diff>
--- a/Temperature_Conversion_System_Milestone_3_Report.docx
+++ b/Temperature_Conversion_System_Milestone_3_Report.docx
@@ -4,7 +4,7 @@
   <w:body>
     <w:p>
       <w:pPr>
-        <w:spacing w:before="400" w:after="40"/>
+        <w:spacing w:before="320" w:after="40"/>
         <w:jc w:val="center"/>
       </w:pPr>
       <w:r>
@@ -19,7 +19,7 @@
     </w:p>
     <w:p>
       <w:pPr>
-        <w:spacing w:after="280"/>
+        <w:spacing w:after="240"/>
         <w:jc w:val="center"/>
       </w:pPr>
       <w:r>
@@ -42,19 +42,24 @@
         <w:gridCol w:w="4680"/>
       </w:tblGrid>
       <w:tr>
+        <w:trPr>
+          <w:cantSplit/>
+          <w:tblHeader/>
+        </w:trPr>
         <w:tc>
           <w:tcPr>
-            <w:tcW w:type="dxa" w:w="3312"/>
+            <w:tcW w:type="dxa" w:w="3168"/>
             <w:shd w:fill="F1F5F9"/>
             <w:tcMar>
-              <w:top w:w="55" w:type="dxa"/>
-              <w:bottom w:w="55" w:type="dxa"/>
-              <w:left w:w="100" w:type="dxa"/>
-              <w:right w:w="100" w:type="dxa"/>
+              <w:top w:w="50" w:type="dxa"/>
+              <w:bottom w:w="50" w:type="dxa"/>
+              <w:left w:w="90" w:type="dxa"/>
+              <w:right w:w="90" w:type="dxa"/>
             </w:tcMar>
           </w:tcPr>
           <w:p>
             <w:pPr>
+              <w:keepNext/>
               <w:spacing w:after="0"/>
             </w:pPr>
             <w:r>
@@ -69,17 +74,18 @@
         </w:tc>
         <w:tc>
           <w:tcPr>
-            <w:tcW w:type="dxa" w:w="6048"/>
+            <w:tcW w:type="dxa" w:w="6192"/>
             <w:shd w:fill="F8FAFC"/>
             <w:tcMar>
-              <w:top w:w="55" w:type="dxa"/>
-              <w:bottom w:w="55" w:type="dxa"/>
-              <w:left w:w="100" w:type="dxa"/>
-              <w:right w:w="100" w:type="dxa"/>
+              <w:top w:w="50" w:type="dxa"/>
+              <w:bottom w:w="50" w:type="dxa"/>
+              <w:left w:w="90" w:type="dxa"/>
+              <w:right w:w="90" w:type="dxa"/>
             </w:tcMar>
           </w:tcPr>
           <w:p>
             <w:pPr>
+              <w:keepNext/>
               <w:spacing w:after="0"/>
             </w:pPr>
             <w:r>
@@ -93,19 +99,23 @@
         </w:tc>
       </w:tr>
       <w:tr>
+        <w:trPr>
+          <w:cantSplit/>
+        </w:trPr>
         <w:tc>
           <w:tcPr>
-            <w:tcW w:type="dxa" w:w="3312"/>
+            <w:tcW w:type="dxa" w:w="3168"/>
             <w:shd w:fill="F1F5F9"/>
             <w:tcMar>
-              <w:top w:w="55" w:type="dxa"/>
-              <w:bottom w:w="55" w:type="dxa"/>
-              <w:left w:w="100" w:type="dxa"/>
-              <w:right w:w="100" w:type="dxa"/>
+              <w:top w:w="50" w:type="dxa"/>
+              <w:bottom w:w="50" w:type="dxa"/>
+              <w:left w:w="90" w:type="dxa"/>
+              <w:right w:w="90" w:type="dxa"/>
             </w:tcMar>
           </w:tcPr>
           <w:p>
             <w:pPr>
+              <w:keepNext/>
               <w:spacing w:after="0"/>
             </w:pPr>
             <w:r>
@@ -120,17 +130,18 @@
         </w:tc>
         <w:tc>
           <w:tcPr>
-            <w:tcW w:type="dxa" w:w="6048"/>
+            <w:tcW w:type="dxa" w:w="6192"/>
             <w:shd w:fill="F8FAFC"/>
             <w:tcMar>
-              <w:top w:w="55" w:type="dxa"/>
-              <w:bottom w:w="55" w:type="dxa"/>
-              <w:left w:w="100" w:type="dxa"/>
-              <w:right w:w="100" w:type="dxa"/>
+              <w:top w:w="50" w:type="dxa"/>
+              <w:bottom w:w="50" w:type="dxa"/>
+              <w:left w:w="90" w:type="dxa"/>
+              <w:right w:w="90" w:type="dxa"/>
             </w:tcMar>
           </w:tcPr>
           <w:p>
             <w:pPr>
+              <w:keepNext/>
               <w:spacing w:after="0"/>
             </w:pPr>
             <w:r>
@@ -144,19 +155,23 @@
         </w:tc>
       </w:tr>
       <w:tr>
+        <w:trPr>
+          <w:cantSplit/>
+        </w:trPr>
         <w:tc>
           <w:tcPr>
-            <w:tcW w:type="dxa" w:w="3312"/>
+            <w:tcW w:type="dxa" w:w="3168"/>
             <w:shd w:fill="F1F5F9"/>
             <w:tcMar>
-              <w:top w:w="55" w:type="dxa"/>
-              <w:bottom w:w="55" w:type="dxa"/>
-              <w:left w:w="100" w:type="dxa"/>
-              <w:right w:w="100" w:type="dxa"/>
+              <w:top w:w="50" w:type="dxa"/>
+              <w:bottom w:w="50" w:type="dxa"/>
+              <w:left w:w="90" w:type="dxa"/>
+              <w:right w:w="90" w:type="dxa"/>
             </w:tcMar>
           </w:tcPr>
           <w:p>
             <w:pPr>
+              <w:keepNext/>
               <w:spacing w:after="0"/>
             </w:pPr>
             <w:r>
@@ -171,17 +186,18 @@
         </w:tc>
         <w:tc>
           <w:tcPr>
-            <w:tcW w:type="dxa" w:w="6048"/>
+            <w:tcW w:type="dxa" w:w="6192"/>
             <w:shd w:fill="F8FAFC"/>
             <w:tcMar>
-              <w:top w:w="55" w:type="dxa"/>
-              <w:bottom w:w="55" w:type="dxa"/>
-              <w:left w:w="100" w:type="dxa"/>
-              <w:right w:w="100" w:type="dxa"/>
+              <w:top w:w="50" w:type="dxa"/>
+              <w:bottom w:w="50" w:type="dxa"/>
+              <w:left w:w="90" w:type="dxa"/>
+              <w:right w:w="90" w:type="dxa"/>
             </w:tcMar>
           </w:tcPr>
           <w:p>
             <w:pPr>
+              <w:keepNext/>
               <w:spacing w:after="0"/>
             </w:pPr>
             <w:r>
@@ -195,19 +211,23 @@
         </w:tc>
       </w:tr>
       <w:tr>
+        <w:trPr>
+          <w:cantSplit/>
+        </w:trPr>
         <w:tc>
           <w:tcPr>
-            <w:tcW w:type="dxa" w:w="3312"/>
+            <w:tcW w:type="dxa" w:w="3168"/>
             <w:shd w:fill="F1F5F9"/>
             <w:tcMar>
-              <w:top w:w="55" w:type="dxa"/>
-              <w:bottom w:w="55" w:type="dxa"/>
-              <w:left w:w="100" w:type="dxa"/>
-              <w:right w:w="100" w:type="dxa"/>
+              <w:top w:w="50" w:type="dxa"/>
+              <w:bottom w:w="50" w:type="dxa"/>
+              <w:left w:w="90" w:type="dxa"/>
+              <w:right w:w="90" w:type="dxa"/>
             </w:tcMar>
           </w:tcPr>
           <w:p>
             <w:pPr>
+              <w:keepNext/>
               <w:spacing w:after="0"/>
             </w:pPr>
             <w:r>
@@ -222,17 +242,18 @@
         </w:tc>
         <w:tc>
           <w:tcPr>
-            <w:tcW w:type="dxa" w:w="6048"/>
+            <w:tcW w:type="dxa" w:w="6192"/>
             <w:shd w:fill="F8FAFC"/>
             <w:tcMar>
-              <w:top w:w="55" w:type="dxa"/>
-              <w:bottom w:w="55" w:type="dxa"/>
-              <w:left w:w="100" w:type="dxa"/>
-              <w:right w:w="100" w:type="dxa"/>
+              <w:top w:w="50" w:type="dxa"/>
+              <w:bottom w:w="50" w:type="dxa"/>
+              <w:left w:w="90" w:type="dxa"/>
+              <w:right w:w="90" w:type="dxa"/>
             </w:tcMar>
           </w:tcPr>
           <w:p>
             <w:pPr>
+              <w:keepNext/>
               <w:spacing w:after="0"/>
             </w:pPr>
             <w:r>
@@ -246,19 +267,23 @@
         </w:tc>
       </w:tr>
       <w:tr>
+        <w:trPr>
+          <w:cantSplit/>
+        </w:trPr>
         <w:tc>
           <w:tcPr>
-            <w:tcW w:type="dxa" w:w="3312"/>
+            <w:tcW w:type="dxa" w:w="3168"/>
             <w:shd w:fill="F1F5F9"/>
             <w:tcMar>
-              <w:top w:w="55" w:type="dxa"/>
-              <w:bottom w:w="55" w:type="dxa"/>
-              <w:left w:w="100" w:type="dxa"/>
-              <w:right w:w="100" w:type="dxa"/>
+              <w:top w:w="50" w:type="dxa"/>
+              <w:bottom w:w="50" w:type="dxa"/>
+              <w:left w:w="90" w:type="dxa"/>
+              <w:right w:w="90" w:type="dxa"/>
             </w:tcMar>
           </w:tcPr>
           <w:p>
             <w:pPr>
+              <w:keepNext/>
               <w:spacing w:after="0"/>
             </w:pPr>
             <w:r>
@@ -273,17 +298,18 @@
         </w:tc>
         <w:tc>
           <w:tcPr>
-            <w:tcW w:type="dxa" w:w="6048"/>
+            <w:tcW w:type="dxa" w:w="6192"/>
             <w:shd w:fill="F8FAFC"/>
             <w:tcMar>
-              <w:top w:w="55" w:type="dxa"/>
-              <w:bottom w:w="55" w:type="dxa"/>
-              <w:left w:w="100" w:type="dxa"/>
-              <w:right w:w="100" w:type="dxa"/>
+              <w:top w:w="50" w:type="dxa"/>
+              <w:bottom w:w="50" w:type="dxa"/>
+              <w:left w:w="90" w:type="dxa"/>
+              <w:right w:w="90" w:type="dxa"/>
             </w:tcMar>
           </w:tcPr>
           <w:p>
             <w:pPr>
+              <w:keepNext/>
               <w:spacing w:after="0"/>
             </w:pPr>
             <w:r>
@@ -297,19 +323,23 @@
         </w:tc>
       </w:tr>
       <w:tr>
+        <w:trPr>
+          <w:cantSplit/>
+        </w:trPr>
         <w:tc>
           <w:tcPr>
-            <w:tcW w:type="dxa" w:w="3312"/>
+            <w:tcW w:type="dxa" w:w="3168"/>
             <w:shd w:fill="F1F5F9"/>
             <w:tcMar>
-              <w:top w:w="55" w:type="dxa"/>
-              <w:bottom w:w="55" w:type="dxa"/>
-              <w:left w:w="100" w:type="dxa"/>
-              <w:right w:w="100" w:type="dxa"/>
+              <w:top w:w="50" w:type="dxa"/>
+              <w:bottom w:w="50" w:type="dxa"/>
+              <w:left w:w="90" w:type="dxa"/>
+              <w:right w:w="90" w:type="dxa"/>
             </w:tcMar>
           </w:tcPr>
           <w:p>
             <w:pPr>
+              <w:keepNext/>
               <w:spacing w:after="0"/>
             </w:pPr>
             <w:r>
@@ -324,17 +354,18 @@
         </w:tc>
         <w:tc>
           <w:tcPr>
-            <w:tcW w:type="dxa" w:w="6048"/>
+            <w:tcW w:type="dxa" w:w="6192"/>
             <w:shd w:fill="F8FAFC"/>
             <w:tcMar>
-              <w:top w:w="55" w:type="dxa"/>
-              <w:bottom w:w="55" w:type="dxa"/>
-              <w:left w:w="100" w:type="dxa"/>
-              <w:right w:w="100" w:type="dxa"/>
+              <w:top w:w="50" w:type="dxa"/>
+              <w:bottom w:w="50" w:type="dxa"/>
+              <w:left w:w="90" w:type="dxa"/>
+              <w:right w:w="90" w:type="dxa"/>
             </w:tcMar>
           </w:tcPr>
           <w:p>
             <w:pPr>
+              <w:keepNext/>
               <w:spacing w:after="0"/>
             </w:pPr>
             <w:r>
@@ -348,19 +379,23 @@
         </w:tc>
       </w:tr>
       <w:tr>
+        <w:trPr>
+          <w:cantSplit/>
+        </w:trPr>
         <w:tc>
           <w:tcPr>
-            <w:tcW w:type="dxa" w:w="3312"/>
+            <w:tcW w:type="dxa" w:w="3168"/>
             <w:shd w:fill="F1F5F9"/>
             <w:tcMar>
-              <w:top w:w="55" w:type="dxa"/>
-              <w:bottom w:w="55" w:type="dxa"/>
-              <w:left w:w="100" w:type="dxa"/>
-              <w:right w:w="100" w:type="dxa"/>
+              <w:top w:w="50" w:type="dxa"/>
+              <w:bottom w:w="50" w:type="dxa"/>
+              <w:left w:w="90" w:type="dxa"/>
+              <w:right w:w="90" w:type="dxa"/>
             </w:tcMar>
           </w:tcPr>
           <w:p>
             <w:pPr>
+              <w:keepNext/>
               <w:spacing w:after="0"/>
             </w:pPr>
             <w:r>
@@ -375,17 +410,18 @@
         </w:tc>
         <w:tc>
           <w:tcPr>
-            <w:tcW w:type="dxa" w:w="6048"/>
+            <w:tcW w:type="dxa" w:w="6192"/>
             <w:shd w:fill="F8FAFC"/>
             <w:tcMar>
-              <w:top w:w="55" w:type="dxa"/>
-              <w:bottom w:w="55" w:type="dxa"/>
-              <w:left w:w="100" w:type="dxa"/>
-              <w:right w:w="100" w:type="dxa"/>
+              <w:top w:w="50" w:type="dxa"/>
+              <w:bottom w:w="50" w:type="dxa"/>
+              <w:left w:w="90" w:type="dxa"/>
+              <w:right w:w="90" w:type="dxa"/>
             </w:tcMar>
           </w:tcPr>
           <w:p>
             <w:pPr>
+              <w:keepNext/>
               <w:spacing w:after="0"/>
             </w:pPr>
             <w:r>
@@ -399,19 +435,23 @@
         </w:tc>
       </w:tr>
       <w:tr>
+        <w:trPr>
+          <w:cantSplit/>
+        </w:trPr>
         <w:tc>
           <w:tcPr>
-            <w:tcW w:type="dxa" w:w="3312"/>
+            <w:tcW w:type="dxa" w:w="3168"/>
             <w:shd w:fill="F1F5F9"/>
             <w:tcMar>
-              <w:top w:w="55" w:type="dxa"/>
-              <w:bottom w:w="55" w:type="dxa"/>
-              <w:left w:w="100" w:type="dxa"/>
-              <w:right w:w="100" w:type="dxa"/>
+              <w:top w:w="50" w:type="dxa"/>
+              <w:bottom w:w="50" w:type="dxa"/>
+              <w:left w:w="90" w:type="dxa"/>
+              <w:right w:w="90" w:type="dxa"/>
             </w:tcMar>
           </w:tcPr>
           <w:p>
             <w:pPr>
+              <w:keepNext/>
               <w:spacing w:after="0"/>
             </w:pPr>
             <w:r>
@@ -426,17 +466,18 @@
         </w:tc>
         <w:tc>
           <w:tcPr>
-            <w:tcW w:type="dxa" w:w="6048"/>
+            <w:tcW w:type="dxa" w:w="6192"/>
             <w:shd w:fill="F8FAFC"/>
             <w:tcMar>
-              <w:top w:w="55" w:type="dxa"/>
-              <w:bottom w:w="55" w:type="dxa"/>
-              <w:left w:w="100" w:type="dxa"/>
-              <w:right w:w="100" w:type="dxa"/>
+              <w:top w:w="50" w:type="dxa"/>
+              <w:bottom w:w="50" w:type="dxa"/>
+              <w:left w:w="90" w:type="dxa"/>
+              <w:right w:w="90" w:type="dxa"/>
             </w:tcMar>
           </w:tcPr>
           <w:p>
             <w:pPr>
+              <w:keepNext/>
               <w:spacing w:after="0"/>
             </w:pPr>
             <w:r>
@@ -450,15 +491,18 @@
         </w:tc>
       </w:tr>
       <w:tr>
+        <w:trPr>
+          <w:cantSplit/>
+        </w:trPr>
         <w:tc>
           <w:tcPr>
-            <w:tcW w:type="dxa" w:w="3312"/>
+            <w:tcW w:type="dxa" w:w="3168"/>
             <w:shd w:fill="F1F5F9"/>
             <w:tcMar>
-              <w:top w:w="55" w:type="dxa"/>
-              <w:bottom w:w="55" w:type="dxa"/>
-              <w:left w:w="100" w:type="dxa"/>
-              <w:right w:w="100" w:type="dxa"/>
+              <w:top w:w="50" w:type="dxa"/>
+              <w:bottom w:w="50" w:type="dxa"/>
+              <w:left w:w="90" w:type="dxa"/>
+              <w:right w:w="90" w:type="dxa"/>
             </w:tcMar>
           </w:tcPr>
           <w:p>
@@ -477,13 +521,13 @@
         </w:tc>
         <w:tc>
           <w:tcPr>
-            <w:tcW w:type="dxa" w:w="6048"/>
+            <w:tcW w:type="dxa" w:w="6192"/>
             <w:shd w:fill="F8FAFC"/>
             <w:tcMar>
-              <w:top w:w="55" w:type="dxa"/>
-              <w:bottom w:w="55" w:type="dxa"/>
-              <w:left w:w="100" w:type="dxa"/>
-              <w:right w:w="100" w:type="dxa"/>
+              <w:top w:w="50" w:type="dxa"/>
+              <w:bottom w:w="50" w:type="dxa"/>
+              <w:left w:w="90" w:type="dxa"/>
+              <w:right w:w="90" w:type="dxa"/>
             </w:tcMar>
           </w:tcPr>
           <w:p>
@@ -503,7 +547,7 @@
     </w:tbl>
     <w:p>
       <w:pPr>
-        <w:spacing w:after="240"/>
+        <w:spacing w:after="160"/>
       </w:pPr>
     </w:p>
     <w:tbl>
@@ -516,6 +560,9 @@
         <w:gridCol w:w="9360"/>
       </w:tblGrid>
       <w:tr>
+        <w:trPr>
+          <w:cantSplit/>
+        </w:trPr>
         <w:tc>
           <w:tcPr>
             <w:tcW w:type="dxa" w:w="9360"/>
@@ -548,7 +595,7 @@
               <w:rPr>
                 <w:color w:val="1F2937"/>
               </w:rPr>
-              <w:t>Milestone 3 successfully converts the architectural specifications into an operational, production-grade software system satisfying all four prescribed deliverables: (1) Modular Source Code (client, server, services, config); (2) Front-End and Back-End Integration via RESTful API; (3) SQLite Database Implementation with WAL persistence; and (4) Version Control Repository synchronized with GitHub and deployed live to GitHub Pages.</w:t>
+              <w:t>Milestone 3 successfully converts architectural specifications into an operational, production-grade software system satisfying all four prescribed deliverables: (1) Modular Source Code (client, server, services, config); (2) Front-End and Back-End Integration via RESTful API; (3) SQLite Database Implementation with WAL persistence; and (4) Version Control Repository synchronized with GitHub and deployed live to GitHub Pages.</w:t>
             </w:r>
           </w:p>
         </w:tc>
@@ -556,8 +603,13 @@
     </w:tbl>
     <w:p>
       <w:pPr>
-        <w:spacing w:after="120"/>
+        <w:spacing w:after="80"/>
       </w:pPr>
+    </w:p>
+    <w:p>
+      <w:r>
+        <w:br w:type="page"/>
+      </w:r>
     </w:p>
     <w:p>
       <w:pPr>
@@ -747,7 +799,7 @@
       <w:r>
         <w:drawing>
           <wp:inline xmlns:a="http://schemas.openxmlformats.org/drawingml/2006/main" xmlns:pic="http://schemas.openxmlformats.org/drawingml/2006/picture">
-            <wp:extent cx="5669280" cy="3865418"/>
+            <wp:extent cx="5303520" cy="3616036"/>
             <wp:docPr id="1" name="Picture 1"/>
             <wp:cNvGraphicFramePr>
               <a:graphicFrameLocks noChangeAspect="1"/>
@@ -768,7 +820,7 @@
                   <pic:spPr>
                     <a:xfrm>
                       <a:off x="0" y="0"/>
-                      <a:ext cx="5669280" cy="3865418"/>
+                      <a:ext cx="5303520" cy="3616036"/>
                     </a:xfrm>
                     <a:prstGeom prst="rect"/>
                   </pic:spPr>
@@ -794,6 +846,11 @@
       </w:r>
     </w:p>
     <w:p>
+      <w:r>
+        <w:br w:type="page"/>
+      </w:r>
+    </w:p>
+    <w:p>
       <w:pPr>
         <w:keepNext/>
         <w:spacing w:before="240" w:after="80"/>
@@ -810,13 +867,14 @@
     </w:p>
     <w:p>
       <w:pPr>
+        <w:keepNext/>
         <w:spacing w:after="120" w:line="276" w:lineRule="auto"/>
       </w:pPr>
       <w:r>
         <w:rPr>
           <w:color w:val="374151"/>
         </w:rPr>
-        <w:t>The codebase is decomposed into cohesive, isolated modules reflecting modern software engineering principles:</w:t>
+        <w:t>The codebase is decomposed into cohesive, isolated modules reflecting modern software engineering principles. Table 1 details each core module and its architectural responsibility:</w:t>
       </w:r>
     </w:p>
     <w:tbl>
@@ -831,18 +889,25 @@
         <w:gridCol w:w="3120"/>
       </w:tblGrid>
       <w:tr>
+        <w:trPr>
+          <w:cantSplit/>
+          <w:tblHeader/>
+        </w:trPr>
         <w:tc>
           <w:tcPr>
-            <w:tcW w:type="dxa" w:w="3120"/>
+            <w:tcW w:type="dxa" w:w="3168"/>
             <w:shd w:fill="1E3A8A"/>
             <w:tcMar>
-              <w:top w:w="70" w:type="dxa"/>
-              <w:bottom w:w="70" w:type="dxa"/>
-              <w:left w:w="90" w:type="dxa"/>
-              <w:right w:w="90" w:type="dxa"/>
+              <w:top w:w="60" w:type="dxa"/>
+              <w:bottom w:w="60" w:type="dxa"/>
+              <w:left w:w="80" w:type="dxa"/>
+              <w:right w:w="80" w:type="dxa"/>
             </w:tcMar>
           </w:tcPr>
           <w:p>
+            <w:pPr>
+              <w:keepNext/>
+            </w:pPr>
             <w:r>
               <w:rPr>
                 <w:b/>
@@ -855,16 +920,19 @@
         </w:tc>
         <w:tc>
           <w:tcPr>
-            <w:tcW w:type="dxa" w:w="3120"/>
+            <w:tcW w:type="dxa" w:w="2160"/>
             <w:shd w:fill="1E3A8A"/>
             <w:tcMar>
-              <w:top w:w="70" w:type="dxa"/>
-              <w:bottom w:w="70" w:type="dxa"/>
-              <w:left w:w="90" w:type="dxa"/>
-              <w:right w:w="90" w:type="dxa"/>
+              <w:top w:w="60" w:type="dxa"/>
+              <w:bottom w:w="60" w:type="dxa"/>
+              <w:left w:w="80" w:type="dxa"/>
+              <w:right w:w="80" w:type="dxa"/>
             </w:tcMar>
           </w:tcPr>
           <w:p>
+            <w:pPr>
+              <w:keepNext/>
+            </w:pPr>
             <w:r>
               <w:rPr>
                 <w:b/>
@@ -877,16 +945,19 @@
         </w:tc>
         <w:tc>
           <w:tcPr>
-            <w:tcW w:type="dxa" w:w="3120"/>
+            <w:tcW w:type="dxa" w:w="4032"/>
             <w:shd w:fill="1E3A8A"/>
             <w:tcMar>
-              <w:top w:w="70" w:type="dxa"/>
-              <w:bottom w:w="70" w:type="dxa"/>
-              <w:left w:w="90" w:type="dxa"/>
-              <w:right w:w="90" w:type="dxa"/>
+              <w:top w:w="60" w:type="dxa"/>
+              <w:bottom w:w="60" w:type="dxa"/>
+              <w:left w:w="80" w:type="dxa"/>
+              <w:right w:w="80" w:type="dxa"/>
             </w:tcMar>
           </w:tcPr>
           <w:p>
+            <w:pPr>
+              <w:keepNext/>
+            </w:pPr>
             <w:r>
               <w:rPr>
                 <w:b/>
@@ -899,18 +970,24 @@
         </w:tc>
       </w:tr>
       <w:tr>
+        <w:trPr>
+          <w:cantSplit/>
+        </w:trPr>
         <w:tc>
           <w:tcPr>
-            <w:tcW w:type="dxa" w:w="3120"/>
+            <w:tcW w:type="dxa" w:w="3168"/>
             <w:shd w:fill="F8FAFC"/>
             <w:tcMar>
-              <w:top w:w="55" w:type="dxa"/>
-              <w:bottom w:w="55" w:type="dxa"/>
-              <w:left w:w="80" w:type="dxa"/>
-              <w:right w:w="80" w:type="dxa"/>
+              <w:top w:w="45" w:type="dxa"/>
+              <w:bottom w:w="45" w:type="dxa"/>
+              <w:left w:w="75" w:type="dxa"/>
+              <w:right w:w="75" w:type="dxa"/>
             </w:tcMar>
           </w:tcPr>
           <w:p>
+            <w:pPr>
+              <w:keepNext/>
+            </w:pPr>
             <w:r>
               <w:rPr>
                 <w:rFonts w:ascii="Consolas" w:hAnsi="Consolas"/>
@@ -924,16 +1001,19 @@
         </w:tc>
         <w:tc>
           <w:tcPr>
-            <w:tcW w:type="dxa" w:w="3120"/>
+            <w:tcW w:type="dxa" w:w="2160"/>
             <w:shd w:fill="F8FAFC"/>
             <w:tcMar>
-              <w:top w:w="55" w:type="dxa"/>
-              <w:bottom w:w="55" w:type="dxa"/>
-              <w:left w:w="80" w:type="dxa"/>
-              <w:right w:w="80" w:type="dxa"/>
+              <w:top w:w="45" w:type="dxa"/>
+              <w:bottom w:w="45" w:type="dxa"/>
+              <w:left w:w="75" w:type="dxa"/>
+              <w:right w:w="75" w:type="dxa"/>
             </w:tcMar>
           </w:tcPr>
           <w:p>
+            <w:pPr>
+              <w:keepNext/>
+            </w:pPr>
             <w:r>
               <w:rPr>
                 <w:sz w:val="17"/>
@@ -944,16 +1024,19 @@
         </w:tc>
         <w:tc>
           <w:tcPr>
-            <w:tcW w:type="dxa" w:w="3120"/>
+            <w:tcW w:type="dxa" w:w="4032"/>
             <w:shd w:fill="F8FAFC"/>
             <w:tcMar>
-              <w:top w:w="55" w:type="dxa"/>
-              <w:bottom w:w="55" w:type="dxa"/>
-              <w:left w:w="80" w:type="dxa"/>
-              <w:right w:w="80" w:type="dxa"/>
+              <w:top w:w="45" w:type="dxa"/>
+              <w:bottom w:w="45" w:type="dxa"/>
+              <w:left w:w="75" w:type="dxa"/>
+              <w:right w:w="75" w:type="dxa"/>
             </w:tcMar>
           </w:tcPr>
           <w:p>
+            <w:pPr>
+              <w:keepNext/>
+            </w:pPr>
             <w:r>
               <w:rPr>
                 <w:sz w:val="17"/>
@@ -964,18 +1047,24 @@
         </w:tc>
       </w:tr>
       <w:tr>
+        <w:trPr>
+          <w:cantSplit/>
+        </w:trPr>
         <w:tc>
           <w:tcPr>
-            <w:tcW w:type="dxa" w:w="3120"/>
+            <w:tcW w:type="dxa" w:w="3168"/>
             <w:shd w:fill="FFFFFF"/>
             <w:tcMar>
-              <w:top w:w="55" w:type="dxa"/>
-              <w:bottom w:w="55" w:type="dxa"/>
-              <w:left w:w="80" w:type="dxa"/>
-              <w:right w:w="80" w:type="dxa"/>
+              <w:top w:w="45" w:type="dxa"/>
+              <w:bottom w:w="45" w:type="dxa"/>
+              <w:left w:w="75" w:type="dxa"/>
+              <w:right w:w="75" w:type="dxa"/>
             </w:tcMar>
           </w:tcPr>
           <w:p>
+            <w:pPr>
+              <w:keepNext/>
+            </w:pPr>
             <w:r>
               <w:rPr>
                 <w:rFonts w:ascii="Consolas" w:hAnsi="Consolas"/>
@@ -989,16 +1078,19 @@
         </w:tc>
         <w:tc>
           <w:tcPr>
-            <w:tcW w:type="dxa" w:w="3120"/>
+            <w:tcW w:type="dxa" w:w="2160"/>
             <w:shd w:fill="FFFFFF"/>
             <w:tcMar>
-              <w:top w:w="55" w:type="dxa"/>
-              <w:bottom w:w="55" w:type="dxa"/>
-              <w:left w:w="80" w:type="dxa"/>
-              <w:right w:w="80" w:type="dxa"/>
+              <w:top w:w="45" w:type="dxa"/>
+              <w:bottom w:w="45" w:type="dxa"/>
+              <w:left w:w="75" w:type="dxa"/>
+              <w:right w:w="75" w:type="dxa"/>
             </w:tcMar>
           </w:tcPr>
           <w:p>
+            <w:pPr>
+              <w:keepNext/>
+            </w:pPr>
             <w:r>
               <w:rPr>
                 <w:sz w:val="17"/>
@@ -1009,16 +1101,19 @@
         </w:tc>
         <w:tc>
           <w:tcPr>
-            <w:tcW w:type="dxa" w:w="3120"/>
+            <w:tcW w:type="dxa" w:w="4032"/>
             <w:shd w:fill="FFFFFF"/>
             <w:tcMar>
-              <w:top w:w="55" w:type="dxa"/>
-              <w:bottom w:w="55" w:type="dxa"/>
-              <w:left w:w="80" w:type="dxa"/>
-              <w:right w:w="80" w:type="dxa"/>
+              <w:top w:w="45" w:type="dxa"/>
+              <w:bottom w:w="45" w:type="dxa"/>
+              <w:left w:w="75" w:type="dxa"/>
+              <w:right w:w="75" w:type="dxa"/>
             </w:tcMar>
           </w:tcPr>
           <w:p>
+            <w:pPr>
+              <w:keepNext/>
+            </w:pPr>
             <w:r>
               <w:rPr>
                 <w:sz w:val="17"/>
@@ -1029,18 +1124,24 @@
         </w:tc>
       </w:tr>
       <w:tr>
+        <w:trPr>
+          <w:cantSplit/>
+        </w:trPr>
         <w:tc>
           <w:tcPr>
-            <w:tcW w:type="dxa" w:w="3120"/>
+            <w:tcW w:type="dxa" w:w="3168"/>
             <w:shd w:fill="F8FAFC"/>
             <w:tcMar>
-              <w:top w:w="55" w:type="dxa"/>
-              <w:bottom w:w="55" w:type="dxa"/>
-              <w:left w:w="80" w:type="dxa"/>
-              <w:right w:w="80" w:type="dxa"/>
+              <w:top w:w="45" w:type="dxa"/>
+              <w:bottom w:w="45" w:type="dxa"/>
+              <w:left w:w="75" w:type="dxa"/>
+              <w:right w:w="75" w:type="dxa"/>
             </w:tcMar>
           </w:tcPr>
           <w:p>
+            <w:pPr>
+              <w:keepNext/>
+            </w:pPr>
             <w:r>
               <w:rPr>
                 <w:rFonts w:ascii="Consolas" w:hAnsi="Consolas"/>
@@ -1054,16 +1155,19 @@
         </w:tc>
         <w:tc>
           <w:tcPr>
-            <w:tcW w:type="dxa" w:w="3120"/>
+            <w:tcW w:type="dxa" w:w="2160"/>
             <w:shd w:fill="F8FAFC"/>
             <w:tcMar>
-              <w:top w:w="55" w:type="dxa"/>
-              <w:bottom w:w="55" w:type="dxa"/>
-              <w:left w:w="80" w:type="dxa"/>
-              <w:right w:w="80" w:type="dxa"/>
+              <w:top w:w="45" w:type="dxa"/>
+              <w:bottom w:w="45" w:type="dxa"/>
+              <w:left w:w="75" w:type="dxa"/>
+              <w:right w:w="75" w:type="dxa"/>
             </w:tcMar>
           </w:tcPr>
           <w:p>
+            <w:pPr>
+              <w:keepNext/>
+            </w:pPr>
             <w:r>
               <w:rPr>
                 <w:sz w:val="17"/>
@@ -1074,16 +1178,19 @@
         </w:tc>
         <w:tc>
           <w:tcPr>
-            <w:tcW w:type="dxa" w:w="3120"/>
+            <w:tcW w:type="dxa" w:w="4032"/>
             <w:shd w:fill="F8FAFC"/>
             <w:tcMar>
-              <w:top w:w="55" w:type="dxa"/>
-              <w:bottom w:w="55" w:type="dxa"/>
-              <w:left w:w="80" w:type="dxa"/>
-              <w:right w:w="80" w:type="dxa"/>
+              <w:top w:w="45" w:type="dxa"/>
+              <w:bottom w:w="45" w:type="dxa"/>
+              <w:left w:w="75" w:type="dxa"/>
+              <w:right w:w="75" w:type="dxa"/>
             </w:tcMar>
           </w:tcPr>
           <w:p>
+            <w:pPr>
+              <w:keepNext/>
+            </w:pPr>
             <w:r>
               <w:rPr>
                 <w:sz w:val="17"/>
@@ -1094,18 +1201,24 @@
         </w:tc>
       </w:tr>
       <w:tr>
+        <w:trPr>
+          <w:cantSplit/>
+        </w:trPr>
         <w:tc>
           <w:tcPr>
-            <w:tcW w:type="dxa" w:w="3120"/>
+            <w:tcW w:type="dxa" w:w="3168"/>
             <w:shd w:fill="FFFFFF"/>
             <w:tcMar>
-              <w:top w:w="55" w:type="dxa"/>
-              <w:bottom w:w="55" w:type="dxa"/>
-              <w:left w:w="80" w:type="dxa"/>
-              <w:right w:w="80" w:type="dxa"/>
+              <w:top w:w="45" w:type="dxa"/>
+              <w:bottom w:w="45" w:type="dxa"/>
+              <w:left w:w="75" w:type="dxa"/>
+              <w:right w:w="75" w:type="dxa"/>
             </w:tcMar>
           </w:tcPr>
           <w:p>
+            <w:pPr>
+              <w:keepNext/>
+            </w:pPr>
             <w:r>
               <w:rPr>
                 <w:rFonts w:ascii="Consolas" w:hAnsi="Consolas"/>
@@ -1119,16 +1232,19 @@
         </w:tc>
         <w:tc>
           <w:tcPr>
-            <w:tcW w:type="dxa" w:w="3120"/>
+            <w:tcW w:type="dxa" w:w="2160"/>
             <w:shd w:fill="FFFFFF"/>
             <w:tcMar>
-              <w:top w:w="55" w:type="dxa"/>
-              <w:bottom w:w="55" w:type="dxa"/>
-              <w:left w:w="80" w:type="dxa"/>
-              <w:right w:w="80" w:type="dxa"/>
+              <w:top w:w="45" w:type="dxa"/>
+              <w:bottom w:w="45" w:type="dxa"/>
+              <w:left w:w="75" w:type="dxa"/>
+              <w:right w:w="75" w:type="dxa"/>
             </w:tcMar>
           </w:tcPr>
           <w:p>
+            <w:pPr>
+              <w:keepNext/>
+            </w:pPr>
             <w:r>
               <w:rPr>
                 <w:sz w:val="17"/>
@@ -1139,16 +1255,19 @@
         </w:tc>
         <w:tc>
           <w:tcPr>
-            <w:tcW w:type="dxa" w:w="3120"/>
+            <w:tcW w:type="dxa" w:w="4032"/>
             <w:shd w:fill="FFFFFF"/>
             <w:tcMar>
-              <w:top w:w="55" w:type="dxa"/>
-              <w:bottom w:w="55" w:type="dxa"/>
-              <w:left w:w="80" w:type="dxa"/>
-              <w:right w:w="80" w:type="dxa"/>
+              <w:top w:w="45" w:type="dxa"/>
+              <w:bottom w:w="45" w:type="dxa"/>
+              <w:left w:w="75" w:type="dxa"/>
+              <w:right w:w="75" w:type="dxa"/>
             </w:tcMar>
           </w:tcPr>
           <w:p>
+            <w:pPr>
+              <w:keepNext/>
+            </w:pPr>
             <w:r>
               <w:rPr>
                 <w:sz w:val="17"/>
@@ -1159,18 +1278,24 @@
         </w:tc>
       </w:tr>
       <w:tr>
+        <w:trPr>
+          <w:cantSplit/>
+        </w:trPr>
         <w:tc>
           <w:tcPr>
-            <w:tcW w:type="dxa" w:w="3120"/>
+            <w:tcW w:type="dxa" w:w="3168"/>
             <w:shd w:fill="F8FAFC"/>
             <w:tcMar>
-              <w:top w:w="55" w:type="dxa"/>
-              <w:bottom w:w="55" w:type="dxa"/>
-              <w:left w:w="80" w:type="dxa"/>
-              <w:right w:w="80" w:type="dxa"/>
+              <w:top w:w="45" w:type="dxa"/>
+              <w:bottom w:w="45" w:type="dxa"/>
+              <w:left w:w="75" w:type="dxa"/>
+              <w:right w:w="75" w:type="dxa"/>
             </w:tcMar>
           </w:tcPr>
           <w:p>
+            <w:pPr>
+              <w:keepNext/>
+            </w:pPr>
             <w:r>
               <w:rPr>
                 <w:rFonts w:ascii="Consolas" w:hAnsi="Consolas"/>
@@ -1184,16 +1309,19 @@
         </w:tc>
         <w:tc>
           <w:tcPr>
-            <w:tcW w:type="dxa" w:w="3120"/>
+            <w:tcW w:type="dxa" w:w="2160"/>
             <w:shd w:fill="F8FAFC"/>
             <w:tcMar>
-              <w:top w:w="55" w:type="dxa"/>
-              <w:bottom w:w="55" w:type="dxa"/>
-              <w:left w:w="80" w:type="dxa"/>
-              <w:right w:w="80" w:type="dxa"/>
+              <w:top w:w="45" w:type="dxa"/>
+              <w:bottom w:w="45" w:type="dxa"/>
+              <w:left w:w="75" w:type="dxa"/>
+              <w:right w:w="75" w:type="dxa"/>
             </w:tcMar>
           </w:tcPr>
           <w:p>
+            <w:pPr>
+              <w:keepNext/>
+            </w:pPr>
             <w:r>
               <w:rPr>
                 <w:sz w:val="17"/>
@@ -1204,16 +1332,19 @@
         </w:tc>
         <w:tc>
           <w:tcPr>
-            <w:tcW w:type="dxa" w:w="3120"/>
+            <w:tcW w:type="dxa" w:w="4032"/>
             <w:shd w:fill="F8FAFC"/>
             <w:tcMar>
-              <w:top w:w="55" w:type="dxa"/>
-              <w:bottom w:w="55" w:type="dxa"/>
-              <w:left w:w="80" w:type="dxa"/>
-              <w:right w:w="80" w:type="dxa"/>
+              <w:top w:w="45" w:type="dxa"/>
+              <w:bottom w:w="45" w:type="dxa"/>
+              <w:left w:w="75" w:type="dxa"/>
+              <w:right w:w="75" w:type="dxa"/>
             </w:tcMar>
           </w:tcPr>
           <w:p>
+            <w:pPr>
+              <w:keepNext/>
+            </w:pPr>
             <w:r>
               <w:rPr>
                 <w:sz w:val="17"/>
@@ -1224,18 +1355,24 @@
         </w:tc>
       </w:tr>
       <w:tr>
+        <w:trPr>
+          <w:cantSplit/>
+        </w:trPr>
         <w:tc>
           <w:tcPr>
-            <w:tcW w:type="dxa" w:w="3120"/>
+            <w:tcW w:type="dxa" w:w="3168"/>
             <w:shd w:fill="FFFFFF"/>
             <w:tcMar>
-              <w:top w:w="55" w:type="dxa"/>
-              <w:bottom w:w="55" w:type="dxa"/>
-              <w:left w:w="80" w:type="dxa"/>
-              <w:right w:w="80" w:type="dxa"/>
+              <w:top w:w="45" w:type="dxa"/>
+              <w:bottom w:w="45" w:type="dxa"/>
+              <w:left w:w="75" w:type="dxa"/>
+              <w:right w:w="75" w:type="dxa"/>
             </w:tcMar>
           </w:tcPr>
           <w:p>
+            <w:pPr>
+              <w:keepNext/>
+            </w:pPr>
             <w:r>
               <w:rPr>
                 <w:rFonts w:ascii="Consolas" w:hAnsi="Consolas"/>
@@ -1249,16 +1386,19 @@
         </w:tc>
         <w:tc>
           <w:tcPr>
-            <w:tcW w:type="dxa" w:w="3120"/>
+            <w:tcW w:type="dxa" w:w="2160"/>
             <w:shd w:fill="FFFFFF"/>
             <w:tcMar>
-              <w:top w:w="55" w:type="dxa"/>
-              <w:bottom w:w="55" w:type="dxa"/>
-              <w:left w:w="80" w:type="dxa"/>
-              <w:right w:w="80" w:type="dxa"/>
+              <w:top w:w="45" w:type="dxa"/>
+              <w:bottom w:w="45" w:type="dxa"/>
+              <w:left w:w="75" w:type="dxa"/>
+              <w:right w:w="75" w:type="dxa"/>
             </w:tcMar>
           </w:tcPr>
           <w:p>
+            <w:pPr>
+              <w:keepNext/>
+            </w:pPr>
             <w:r>
               <w:rPr>
                 <w:sz w:val="17"/>
@@ -1269,16 +1409,19 @@
         </w:tc>
         <w:tc>
           <w:tcPr>
-            <w:tcW w:type="dxa" w:w="3120"/>
+            <w:tcW w:type="dxa" w:w="4032"/>
             <w:shd w:fill="FFFFFF"/>
             <w:tcMar>
-              <w:top w:w="55" w:type="dxa"/>
-              <w:bottom w:w="55" w:type="dxa"/>
-              <w:left w:w="80" w:type="dxa"/>
-              <w:right w:w="80" w:type="dxa"/>
+              <w:top w:w="45" w:type="dxa"/>
+              <w:bottom w:w="45" w:type="dxa"/>
+              <w:left w:w="75" w:type="dxa"/>
+              <w:right w:w="75" w:type="dxa"/>
             </w:tcMar>
           </w:tcPr>
           <w:p>
+            <w:pPr>
+              <w:keepNext/>
+            </w:pPr>
             <w:r>
               <w:rPr>
                 <w:sz w:val="17"/>
@@ -1289,18 +1432,24 @@
         </w:tc>
       </w:tr>
       <w:tr>
+        <w:trPr>
+          <w:cantSplit/>
+        </w:trPr>
         <w:tc>
           <w:tcPr>
-            <w:tcW w:type="dxa" w:w="3120"/>
+            <w:tcW w:type="dxa" w:w="3168"/>
             <w:shd w:fill="F8FAFC"/>
             <w:tcMar>
-              <w:top w:w="55" w:type="dxa"/>
-              <w:bottom w:w="55" w:type="dxa"/>
-              <w:left w:w="80" w:type="dxa"/>
-              <w:right w:w="80" w:type="dxa"/>
+              <w:top w:w="45" w:type="dxa"/>
+              <w:bottom w:w="45" w:type="dxa"/>
+              <w:left w:w="75" w:type="dxa"/>
+              <w:right w:w="75" w:type="dxa"/>
             </w:tcMar>
           </w:tcPr>
           <w:p>
+            <w:pPr>
+              <w:keepNext/>
+            </w:pPr>
             <w:r>
               <w:rPr>
                 <w:rFonts w:ascii="Consolas" w:hAnsi="Consolas"/>
@@ -1314,16 +1463,19 @@
         </w:tc>
         <w:tc>
           <w:tcPr>
-            <w:tcW w:type="dxa" w:w="3120"/>
+            <w:tcW w:type="dxa" w:w="2160"/>
             <w:shd w:fill="F8FAFC"/>
             <w:tcMar>
-              <w:top w:w="55" w:type="dxa"/>
-              <w:bottom w:w="55" w:type="dxa"/>
-              <w:left w:w="80" w:type="dxa"/>
-              <w:right w:w="80" w:type="dxa"/>
+              <w:top w:w="45" w:type="dxa"/>
+              <w:bottom w:w="45" w:type="dxa"/>
+              <w:left w:w="75" w:type="dxa"/>
+              <w:right w:w="75" w:type="dxa"/>
             </w:tcMar>
           </w:tcPr>
           <w:p>
+            <w:pPr>
+              <w:keepNext/>
+            </w:pPr>
             <w:r>
               <w:rPr>
                 <w:sz w:val="17"/>
@@ -1334,16 +1486,19 @@
         </w:tc>
         <w:tc>
           <w:tcPr>
-            <w:tcW w:type="dxa" w:w="3120"/>
+            <w:tcW w:type="dxa" w:w="4032"/>
             <w:shd w:fill="F8FAFC"/>
             <w:tcMar>
-              <w:top w:w="55" w:type="dxa"/>
-              <w:bottom w:w="55" w:type="dxa"/>
-              <w:left w:w="80" w:type="dxa"/>
-              <w:right w:w="80" w:type="dxa"/>
+              <w:top w:w="45" w:type="dxa"/>
+              <w:bottom w:w="45" w:type="dxa"/>
+              <w:left w:w="75" w:type="dxa"/>
+              <w:right w:w="75" w:type="dxa"/>
             </w:tcMar>
           </w:tcPr>
           <w:p>
+            <w:pPr>
+              <w:keepNext/>
+            </w:pPr>
             <w:r>
               <w:rPr>
                 <w:sz w:val="17"/>
@@ -1354,15 +1509,18 @@
         </w:tc>
       </w:tr>
       <w:tr>
+        <w:trPr>
+          <w:cantSplit/>
+        </w:trPr>
         <w:tc>
           <w:tcPr>
-            <w:tcW w:type="dxa" w:w="3120"/>
+            <w:tcW w:type="dxa" w:w="3168"/>
             <w:shd w:fill="FFFFFF"/>
             <w:tcMar>
-              <w:top w:w="55" w:type="dxa"/>
-              <w:bottom w:w="55" w:type="dxa"/>
-              <w:left w:w="80" w:type="dxa"/>
-              <w:right w:w="80" w:type="dxa"/>
+              <w:top w:w="45" w:type="dxa"/>
+              <w:bottom w:w="45" w:type="dxa"/>
+              <w:left w:w="75" w:type="dxa"/>
+              <w:right w:w="75" w:type="dxa"/>
             </w:tcMar>
           </w:tcPr>
           <w:p>
@@ -1379,13 +1537,13 @@
         </w:tc>
         <w:tc>
           <w:tcPr>
-            <w:tcW w:type="dxa" w:w="3120"/>
+            <w:tcW w:type="dxa" w:w="2160"/>
             <w:shd w:fill="FFFFFF"/>
             <w:tcMar>
-              <w:top w:w="55" w:type="dxa"/>
-              <w:bottom w:w="55" w:type="dxa"/>
-              <w:left w:w="80" w:type="dxa"/>
-              <w:right w:w="80" w:type="dxa"/>
+              <w:top w:w="45" w:type="dxa"/>
+              <w:bottom w:w="45" w:type="dxa"/>
+              <w:left w:w="75" w:type="dxa"/>
+              <w:right w:w="75" w:type="dxa"/>
             </w:tcMar>
           </w:tcPr>
           <w:p>
@@ -1399,13 +1557,13 @@
         </w:tc>
         <w:tc>
           <w:tcPr>
-            <w:tcW w:type="dxa" w:w="3120"/>
+            <w:tcW w:type="dxa" w:w="4032"/>
             <w:shd w:fill="FFFFFF"/>
             <w:tcMar>
-              <w:top w:w="55" w:type="dxa"/>
-              <w:bottom w:w="55" w:type="dxa"/>
-              <w:left w:w="80" w:type="dxa"/>
-              <w:right w:w="80" w:type="dxa"/>
+              <w:top w:w="45" w:type="dxa"/>
+              <w:bottom w:w="45" w:type="dxa"/>
+              <w:left w:w="75" w:type="dxa"/>
+              <w:right w:w="75" w:type="dxa"/>
             </w:tcMar>
           </w:tcPr>
           <w:p>
@@ -1423,6 +1581,11 @@
       <w:pPr>
         <w:spacing w:after="160"/>
       </w:pPr>
+    </w:p>
+    <w:p>
+      <w:r>
+        <w:br w:type="page"/>
+      </w:r>
     </w:p>
     <w:p>
       <w:pPr>
@@ -1487,7 +1650,7 @@
       <w:r>
         <w:drawing>
           <wp:inline xmlns:a="http://schemas.openxmlformats.org/drawingml/2006/main" xmlns:pic="http://schemas.openxmlformats.org/drawingml/2006/picture">
-            <wp:extent cx="5669280" cy="3685032"/>
+            <wp:extent cx="5486400" cy="3578087"/>
             <wp:docPr id="2" name="Picture 2"/>
             <wp:cNvGraphicFramePr>
               <a:graphicFrameLocks noChangeAspect="1"/>
@@ -1508,7 +1671,7 @@
                   <pic:spPr>
                     <a:xfrm>
                       <a:off x="0" y="0"/>
-                      <a:ext cx="5669280" cy="3685032"/>
+                      <a:ext cx="5486400" cy="3578087"/>
                     </a:xfrm>
                     <a:prstGeom prst="rect"/>
                   </pic:spPr>
@@ -1598,6 +1761,11 @@
       </w:r>
     </w:p>
     <w:p>
+      <w:r>
+        <w:br w:type="page"/>
+      </w:r>
+    </w:p>
+    <w:p>
       <w:pPr>
         <w:keepNext/>
         <w:spacing w:before="360" w:after="120"/>
@@ -1614,13 +1782,14 @@
     </w:p>
     <w:p>
       <w:pPr>
+        <w:keepNext/>
         <w:spacing w:after="120" w:line="276" w:lineRule="auto"/>
       </w:pPr>
       <w:r>
         <w:rPr>
           <w:color w:val="374151"/>
         </w:rPr>
-        <w:t>The frontend communicates with the backend asynchronously through JSON-encoded HTTP REST requests. The API surface provides the following endpoints:</w:t>
+        <w:t>The frontend communicates with the backend asynchronously through JSON-encoded HTTP REST requests. Table 2 details the complete RESTful endpoint specification:</w:t>
       </w:r>
     </w:p>
     <w:tbl>
@@ -1636,18 +1805,25 @@
         <w:gridCol w:w="2340"/>
       </w:tblGrid>
       <w:tr>
+        <w:trPr>
+          <w:cantSplit/>
+          <w:tblHeader/>
+        </w:trPr>
         <w:tc>
           <w:tcPr>
-            <w:tcW w:type="dxa" w:w="2340"/>
+            <w:tcW w:type="dxa" w:w="1296"/>
             <w:shd w:fill="1E3A8A"/>
             <w:tcMar>
-              <w:top w:w="70" w:type="dxa"/>
-              <w:bottom w:w="70" w:type="dxa"/>
-              <w:left w:w="80" w:type="dxa"/>
-              <w:right w:w="80" w:type="dxa"/>
+              <w:top w:w="60" w:type="dxa"/>
+              <w:bottom w:w="60" w:type="dxa"/>
+              <w:left w:w="75" w:type="dxa"/>
+              <w:right w:w="75" w:type="dxa"/>
             </w:tcMar>
           </w:tcPr>
           <w:p>
+            <w:pPr>
+              <w:keepNext/>
+            </w:pPr>
             <w:r>
               <w:rPr>
                 <w:b/>
@@ -1660,16 +1836,19 @@
         </w:tc>
         <w:tc>
           <w:tcPr>
-            <w:tcW w:type="dxa" w:w="2340"/>
+            <w:tcW w:type="dxa" w:w="1872"/>
             <w:shd w:fill="1E3A8A"/>
             <w:tcMar>
-              <w:top w:w="70" w:type="dxa"/>
-              <w:bottom w:w="70" w:type="dxa"/>
-              <w:left w:w="80" w:type="dxa"/>
-              <w:right w:w="80" w:type="dxa"/>
+              <w:top w:w="60" w:type="dxa"/>
+              <w:bottom w:w="60" w:type="dxa"/>
+              <w:left w:w="75" w:type="dxa"/>
+              <w:right w:w="75" w:type="dxa"/>
             </w:tcMar>
           </w:tcPr>
           <w:p>
+            <w:pPr>
+              <w:keepNext/>
+            </w:pPr>
             <w:r>
               <w:rPr>
                 <w:b/>
@@ -1682,16 +1861,19 @@
         </w:tc>
         <w:tc>
           <w:tcPr>
-            <w:tcW w:type="dxa" w:w="2340"/>
+            <w:tcW w:type="dxa" w:w="2448"/>
             <w:shd w:fill="1E3A8A"/>
             <w:tcMar>
-              <w:top w:w="70" w:type="dxa"/>
-              <w:bottom w:w="70" w:type="dxa"/>
-              <w:left w:w="80" w:type="dxa"/>
-              <w:right w:w="80" w:type="dxa"/>
+              <w:top w:w="60" w:type="dxa"/>
+              <w:bottom w:w="60" w:type="dxa"/>
+              <w:left w:w="75" w:type="dxa"/>
+              <w:right w:w="75" w:type="dxa"/>
             </w:tcMar>
           </w:tcPr>
           <w:p>
+            <w:pPr>
+              <w:keepNext/>
+            </w:pPr>
             <w:r>
               <w:rPr>
                 <w:b/>
@@ -1704,16 +1886,19 @@
         </w:tc>
         <w:tc>
           <w:tcPr>
-            <w:tcW w:type="dxa" w:w="2340"/>
+            <w:tcW w:type="dxa" w:w="3744"/>
             <w:shd w:fill="1E3A8A"/>
             <w:tcMar>
-              <w:top w:w="70" w:type="dxa"/>
-              <w:bottom w:w="70" w:type="dxa"/>
-              <w:left w:w="80" w:type="dxa"/>
-              <w:right w:w="80" w:type="dxa"/>
+              <w:top w:w="60" w:type="dxa"/>
+              <w:bottom w:w="60" w:type="dxa"/>
+              <w:left w:w="75" w:type="dxa"/>
+              <w:right w:w="75" w:type="dxa"/>
             </w:tcMar>
           </w:tcPr>
           <w:p>
+            <w:pPr>
+              <w:keepNext/>
+            </w:pPr>
             <w:r>
               <w:rPr>
                 <w:b/>
@@ -1726,18 +1911,24 @@
         </w:tc>
       </w:tr>
       <w:tr>
+        <w:trPr>
+          <w:cantSplit/>
+        </w:trPr>
         <w:tc>
           <w:tcPr>
-            <w:tcW w:type="dxa" w:w="2340"/>
+            <w:tcW w:type="dxa" w:w="1296"/>
             <w:shd w:fill="F8FAFC"/>
             <w:tcMar>
-              <w:top w:w="55" w:type="dxa"/>
-              <w:bottom w:w="55" w:type="dxa"/>
-              <w:left w:w="70" w:type="dxa"/>
-              <w:right w:w="70" w:type="dxa"/>
+              <w:top w:w="45" w:type="dxa"/>
+              <w:bottom w:w="45" w:type="dxa"/>
+              <w:left w:w="65" w:type="dxa"/>
+              <w:right w:w="65" w:type="dxa"/>
             </w:tcMar>
           </w:tcPr>
           <w:p>
+            <w:pPr>
+              <w:keepNext/>
+            </w:pPr>
             <w:r>
               <w:rPr>
                 <w:rFonts w:ascii="Consolas" w:hAnsi="Consolas"/>
@@ -1750,16 +1941,19 @@
         </w:tc>
         <w:tc>
           <w:tcPr>
-            <w:tcW w:type="dxa" w:w="2340"/>
+            <w:tcW w:type="dxa" w:w="1872"/>
             <w:shd w:fill="F8FAFC"/>
             <w:tcMar>
-              <w:top w:w="55" w:type="dxa"/>
-              <w:bottom w:w="55" w:type="dxa"/>
-              <w:left w:w="70" w:type="dxa"/>
-              <w:right w:w="70" w:type="dxa"/>
+              <w:top w:w="45" w:type="dxa"/>
+              <w:bottom w:w="45" w:type="dxa"/>
+              <w:left w:w="65" w:type="dxa"/>
+              <w:right w:w="65" w:type="dxa"/>
             </w:tcMar>
           </w:tcPr>
           <w:p>
+            <w:pPr>
+              <w:keepNext/>
+            </w:pPr>
             <w:r>
               <w:rPr>
                 <w:rFonts w:ascii="Consolas" w:hAnsi="Consolas"/>
@@ -1772,16 +1966,19 @@
         </w:tc>
         <w:tc>
           <w:tcPr>
-            <w:tcW w:type="dxa" w:w="2340"/>
+            <w:tcW w:type="dxa" w:w="2448"/>
             <w:shd w:fill="F8FAFC"/>
             <w:tcMar>
-              <w:top w:w="55" w:type="dxa"/>
-              <w:bottom w:w="55" w:type="dxa"/>
-              <w:left w:w="70" w:type="dxa"/>
-              <w:right w:w="70" w:type="dxa"/>
+              <w:top w:w="45" w:type="dxa"/>
+              <w:bottom w:w="45" w:type="dxa"/>
+              <w:left w:w="65" w:type="dxa"/>
+              <w:right w:w="65" w:type="dxa"/>
             </w:tcMar>
           </w:tcPr>
           <w:p>
+            <w:pPr>
+              <w:keepNext/>
+            </w:pPr>
             <w:r>
               <w:rPr>
                 <w:sz w:val="17"/>
@@ -1792,16 +1989,19 @@
         </w:tc>
         <w:tc>
           <w:tcPr>
-            <w:tcW w:type="dxa" w:w="2340"/>
+            <w:tcW w:type="dxa" w:w="3744"/>
             <w:shd w:fill="F8FAFC"/>
             <w:tcMar>
-              <w:top w:w="55" w:type="dxa"/>
-              <w:bottom w:w="55" w:type="dxa"/>
-              <w:left w:w="70" w:type="dxa"/>
-              <w:right w:w="70" w:type="dxa"/>
+              <w:top w:w="45" w:type="dxa"/>
+              <w:bottom w:w="45" w:type="dxa"/>
+              <w:left w:w="65" w:type="dxa"/>
+              <w:right w:w="65" w:type="dxa"/>
             </w:tcMar>
           </w:tcPr>
           <w:p>
+            <w:pPr>
+              <w:keepNext/>
+            </w:pPr>
             <w:r>
               <w:rPr>
                 <w:sz w:val="17"/>
@@ -1812,15 +2012,422 @@
         </w:tc>
       </w:tr>
       <w:tr>
+        <w:trPr>
+          <w:cantSplit/>
+        </w:trPr>
         <w:tc>
           <w:tcPr>
-            <w:tcW w:type="dxa" w:w="2340"/>
+            <w:tcW w:type="dxa" w:w="1296"/>
             <w:shd w:fill="FFFFFF"/>
             <w:tcMar>
-              <w:top w:w="55" w:type="dxa"/>
-              <w:bottom w:w="55" w:type="dxa"/>
-              <w:left w:w="70" w:type="dxa"/>
-              <w:right w:w="70" w:type="dxa"/>
+              <w:top w:w="45" w:type="dxa"/>
+              <w:bottom w:w="45" w:type="dxa"/>
+              <w:left w:w="65" w:type="dxa"/>
+              <w:right w:w="65" w:type="dxa"/>
+            </w:tcMar>
+          </w:tcPr>
+          <w:p>
+            <w:pPr>
+              <w:keepNext/>
+            </w:pPr>
+            <w:r>
+              <w:rPr>
+                <w:rFonts w:ascii="Consolas" w:hAnsi="Consolas"/>
+                <w:b/>
+                <w:sz w:val="17"/>
+              </w:rPr>
+              <w:t>GET</w:t>
+            </w:r>
+          </w:p>
+        </w:tc>
+        <w:tc>
+          <w:tcPr>
+            <w:tcW w:type="dxa" w:w="1872"/>
+            <w:shd w:fill="FFFFFF"/>
+            <w:tcMar>
+              <w:top w:w="45" w:type="dxa"/>
+              <w:bottom w:w="45" w:type="dxa"/>
+              <w:left w:w="65" w:type="dxa"/>
+              <w:right w:w="65" w:type="dxa"/>
+            </w:tcMar>
+          </w:tcPr>
+          <w:p>
+            <w:pPr>
+              <w:keepNext/>
+            </w:pPr>
+            <w:r>
+              <w:rPr>
+                <w:rFonts w:ascii="Consolas" w:hAnsi="Consolas"/>
+                <w:b/>
+                <w:sz w:val="17"/>
+              </w:rPr>
+              <w:t>/api/history</w:t>
+            </w:r>
+          </w:p>
+        </w:tc>
+        <w:tc>
+          <w:tcPr>
+            <w:tcW w:type="dxa" w:w="2448"/>
+            <w:shd w:fill="FFFFFF"/>
+            <w:tcMar>
+              <w:top w:w="45" w:type="dxa"/>
+              <w:bottom w:w="45" w:type="dxa"/>
+              <w:left w:w="65" w:type="dxa"/>
+              <w:right w:w="65" w:type="dxa"/>
+            </w:tcMar>
+          </w:tcPr>
+          <w:p>
+            <w:pPr>
+              <w:keepNext/>
+            </w:pPr>
+            <w:r>
+              <w:rPr>
+                <w:sz w:val="17"/>
+              </w:rPr>
+              <w:t>?limit=50&amp;offset=0</w:t>
+            </w:r>
+          </w:p>
+        </w:tc>
+        <w:tc>
+          <w:tcPr>
+            <w:tcW w:type="dxa" w:w="3744"/>
+            <w:shd w:fill="FFFFFF"/>
+            <w:tcMar>
+              <w:top w:w="45" w:type="dxa"/>
+              <w:bottom w:w="45" w:type="dxa"/>
+              <w:left w:w="65" w:type="dxa"/>
+              <w:right w:w="65" w:type="dxa"/>
+            </w:tcMar>
+          </w:tcPr>
+          <w:p>
+            <w:pPr>
+              <w:keepNext/>
+            </w:pPr>
+            <w:r>
+              <w:rPr>
+                <w:sz w:val="17"/>
+              </w:rPr>
+              <w:t>Retrieves timestamped conversion logs from SQLite database</w:t>
+            </w:r>
+          </w:p>
+        </w:tc>
+      </w:tr>
+      <w:tr>
+        <w:trPr>
+          <w:cantSplit/>
+        </w:trPr>
+        <w:tc>
+          <w:tcPr>
+            <w:tcW w:type="dxa" w:w="1296"/>
+            <w:shd w:fill="F8FAFC"/>
+            <w:tcMar>
+              <w:top w:w="45" w:type="dxa"/>
+              <w:bottom w:w="45" w:type="dxa"/>
+              <w:left w:w="65" w:type="dxa"/>
+              <w:right w:w="65" w:type="dxa"/>
+            </w:tcMar>
+          </w:tcPr>
+          <w:p>
+            <w:pPr>
+              <w:keepNext/>
+            </w:pPr>
+            <w:r>
+              <w:rPr>
+                <w:rFonts w:ascii="Consolas" w:hAnsi="Consolas"/>
+                <w:b/>
+                <w:sz w:val="17"/>
+              </w:rPr>
+              <w:t>DELETE</w:t>
+            </w:r>
+          </w:p>
+        </w:tc>
+        <w:tc>
+          <w:tcPr>
+            <w:tcW w:type="dxa" w:w="1872"/>
+            <w:shd w:fill="F8FAFC"/>
+            <w:tcMar>
+              <w:top w:w="45" w:type="dxa"/>
+              <w:bottom w:w="45" w:type="dxa"/>
+              <w:left w:w="65" w:type="dxa"/>
+              <w:right w:w="65" w:type="dxa"/>
+            </w:tcMar>
+          </w:tcPr>
+          <w:p>
+            <w:pPr>
+              <w:keepNext/>
+            </w:pPr>
+            <w:r>
+              <w:rPr>
+                <w:rFonts w:ascii="Consolas" w:hAnsi="Consolas"/>
+                <w:b/>
+                <w:sz w:val="17"/>
+              </w:rPr>
+              <w:t>/api/history</w:t>
+            </w:r>
+          </w:p>
+        </w:tc>
+        <w:tc>
+          <w:tcPr>
+            <w:tcW w:type="dxa" w:w="2448"/>
+            <w:shd w:fill="F8FAFC"/>
+            <w:tcMar>
+              <w:top w:w="45" w:type="dxa"/>
+              <w:bottom w:w="45" w:type="dxa"/>
+              <w:left w:w="65" w:type="dxa"/>
+              <w:right w:w="65" w:type="dxa"/>
+            </w:tcMar>
+          </w:tcPr>
+          <w:p>
+            <w:pPr>
+              <w:keepNext/>
+            </w:pPr>
+            <w:r>
+              <w:rPr>
+                <w:sz w:val="17"/>
+              </w:rPr>
+              <w:t>None</w:t>
+            </w:r>
+          </w:p>
+        </w:tc>
+        <w:tc>
+          <w:tcPr>
+            <w:tcW w:type="dxa" w:w="3744"/>
+            <w:shd w:fill="F8FAFC"/>
+            <w:tcMar>
+              <w:top w:w="45" w:type="dxa"/>
+              <w:bottom w:w="45" w:type="dxa"/>
+              <w:left w:w="65" w:type="dxa"/>
+              <w:right w:w="65" w:type="dxa"/>
+            </w:tcMar>
+          </w:tcPr>
+          <w:p>
+            <w:pPr>
+              <w:keepNext/>
+            </w:pPr>
+            <w:r>
+              <w:rPr>
+                <w:sz w:val="17"/>
+              </w:rPr>
+              <w:t>Purges database conversion records and reclaims storage via VACUUM</w:t>
+            </w:r>
+          </w:p>
+        </w:tc>
+      </w:tr>
+      <w:tr>
+        <w:trPr>
+          <w:cantSplit/>
+        </w:trPr>
+        <w:tc>
+          <w:tcPr>
+            <w:tcW w:type="dxa" w:w="1296"/>
+            <w:shd w:fill="FFFFFF"/>
+            <w:tcMar>
+              <w:top w:w="45" w:type="dxa"/>
+              <w:bottom w:w="45" w:type="dxa"/>
+              <w:left w:w="65" w:type="dxa"/>
+              <w:right w:w="65" w:type="dxa"/>
+            </w:tcMar>
+          </w:tcPr>
+          <w:p>
+            <w:pPr>
+              <w:keepNext/>
+            </w:pPr>
+            <w:r>
+              <w:rPr>
+                <w:rFonts w:ascii="Consolas" w:hAnsi="Consolas"/>
+                <w:b/>
+                <w:sz w:val="17"/>
+              </w:rPr>
+              <w:t>GET</w:t>
+            </w:r>
+          </w:p>
+        </w:tc>
+        <w:tc>
+          <w:tcPr>
+            <w:tcW w:type="dxa" w:w="1872"/>
+            <w:shd w:fill="FFFFFF"/>
+            <w:tcMar>
+              <w:top w:w="45" w:type="dxa"/>
+              <w:bottom w:w="45" w:type="dxa"/>
+              <w:left w:w="65" w:type="dxa"/>
+              <w:right w:w="65" w:type="dxa"/>
+            </w:tcMar>
+          </w:tcPr>
+          <w:p>
+            <w:pPr>
+              <w:keepNext/>
+            </w:pPr>
+            <w:r>
+              <w:rPr>
+                <w:rFonts w:ascii="Consolas" w:hAnsi="Consolas"/>
+                <w:b/>
+                <w:sz w:val="17"/>
+              </w:rPr>
+              <w:t>/api/stats</w:t>
+            </w:r>
+          </w:p>
+        </w:tc>
+        <w:tc>
+          <w:tcPr>
+            <w:tcW w:type="dxa" w:w="2448"/>
+            <w:shd w:fill="FFFFFF"/>
+            <w:tcMar>
+              <w:top w:w="45" w:type="dxa"/>
+              <w:bottom w:w="45" w:type="dxa"/>
+              <w:left w:w="65" w:type="dxa"/>
+              <w:right w:w="65" w:type="dxa"/>
+            </w:tcMar>
+          </w:tcPr>
+          <w:p>
+            <w:pPr>
+              <w:keepNext/>
+            </w:pPr>
+            <w:r>
+              <w:rPr>
+                <w:sz w:val="17"/>
+              </w:rPr>
+              <w:t>None</w:t>
+            </w:r>
+          </w:p>
+        </w:tc>
+        <w:tc>
+          <w:tcPr>
+            <w:tcW w:type="dxa" w:w="3744"/>
+            <w:shd w:fill="FFFFFF"/>
+            <w:tcMar>
+              <w:top w:w="45" w:type="dxa"/>
+              <w:bottom w:w="45" w:type="dxa"/>
+              <w:left w:w="65" w:type="dxa"/>
+              <w:right w:w="65" w:type="dxa"/>
+            </w:tcMar>
+          </w:tcPr>
+          <w:p>
+            <w:pPr>
+              <w:keepNext/>
+            </w:pPr>
+            <w:r>
+              <w:rPr>
+                <w:sz w:val="17"/>
+              </w:rPr>
+              <w:t>Returns total conversions count, most frequent scales, and recorded extremes</w:t>
+            </w:r>
+          </w:p>
+        </w:tc>
+      </w:tr>
+      <w:tr>
+        <w:trPr>
+          <w:cantSplit/>
+        </w:trPr>
+        <w:tc>
+          <w:tcPr>
+            <w:tcW w:type="dxa" w:w="1296"/>
+            <w:shd w:fill="F8FAFC"/>
+            <w:tcMar>
+              <w:top w:w="45" w:type="dxa"/>
+              <w:bottom w:w="45" w:type="dxa"/>
+              <w:left w:w="65" w:type="dxa"/>
+              <w:right w:w="65" w:type="dxa"/>
+            </w:tcMar>
+          </w:tcPr>
+          <w:p>
+            <w:pPr>
+              <w:keepNext/>
+            </w:pPr>
+            <w:r>
+              <w:rPr>
+                <w:rFonts w:ascii="Consolas" w:hAnsi="Consolas"/>
+                <w:b/>
+                <w:sz w:val="17"/>
+              </w:rPr>
+              <w:t>GET</w:t>
+            </w:r>
+          </w:p>
+        </w:tc>
+        <w:tc>
+          <w:tcPr>
+            <w:tcW w:type="dxa" w:w="1872"/>
+            <w:shd w:fill="F8FAFC"/>
+            <w:tcMar>
+              <w:top w:w="45" w:type="dxa"/>
+              <w:bottom w:w="45" w:type="dxa"/>
+              <w:left w:w="65" w:type="dxa"/>
+              <w:right w:w="65" w:type="dxa"/>
+            </w:tcMar>
+          </w:tcPr>
+          <w:p>
+            <w:pPr>
+              <w:keepNext/>
+            </w:pPr>
+            <w:r>
+              <w:rPr>
+                <w:rFonts w:ascii="Consolas" w:hAnsi="Consolas"/>
+                <w:b/>
+                <w:sz w:val="17"/>
+              </w:rPr>
+              <w:t>/api/export/csv</w:t>
+            </w:r>
+          </w:p>
+        </w:tc>
+        <w:tc>
+          <w:tcPr>
+            <w:tcW w:type="dxa" w:w="2448"/>
+            <w:shd w:fill="F8FAFC"/>
+            <w:tcMar>
+              <w:top w:w="45" w:type="dxa"/>
+              <w:bottom w:w="45" w:type="dxa"/>
+              <w:left w:w="65" w:type="dxa"/>
+              <w:right w:w="65" w:type="dxa"/>
+            </w:tcMar>
+          </w:tcPr>
+          <w:p>
+            <w:pPr>
+              <w:keepNext/>
+            </w:pPr>
+            <w:r>
+              <w:rPr>
+                <w:sz w:val="17"/>
+              </w:rPr>
+              <w:t>None</w:t>
+            </w:r>
+          </w:p>
+        </w:tc>
+        <w:tc>
+          <w:tcPr>
+            <w:tcW w:type="dxa" w:w="3744"/>
+            <w:shd w:fill="F8FAFC"/>
+            <w:tcMar>
+              <w:top w:w="45" w:type="dxa"/>
+              <w:bottom w:w="45" w:type="dxa"/>
+              <w:left w:w="65" w:type="dxa"/>
+              <w:right w:w="65" w:type="dxa"/>
+            </w:tcMar>
+          </w:tcPr>
+          <w:p>
+            <w:pPr>
+              <w:keepNext/>
+            </w:pPr>
+            <w:r>
+              <w:rPr>
+                <w:sz w:val="17"/>
+              </w:rPr>
+              <w:t>Streams conversion history as a downloadable CSV spreadsheet file</w:t>
+            </w:r>
+          </w:p>
+        </w:tc>
+      </w:tr>
+      <w:tr>
+        <w:trPr>
+          <w:cantSplit/>
+        </w:trPr>
+        <w:tc>
+          <w:tcPr>
+            <w:tcW w:type="dxa" w:w="1296"/>
+            <w:shd w:fill="FFFFFF"/>
+            <w:tcMar>
+              <w:top w:w="45" w:type="dxa"/>
+              <w:bottom w:w="45" w:type="dxa"/>
+              <w:left w:w="65" w:type="dxa"/>
+              <w:right w:w="65" w:type="dxa"/>
             </w:tcMar>
           </w:tcPr>
           <w:p>
@@ -1836,357 +2443,13 @@
         </w:tc>
         <w:tc>
           <w:tcPr>
-            <w:tcW w:type="dxa" w:w="2340"/>
+            <w:tcW w:type="dxa" w:w="1872"/>
             <w:shd w:fill="FFFFFF"/>
             <w:tcMar>
-              <w:top w:w="55" w:type="dxa"/>
-              <w:bottom w:w="55" w:type="dxa"/>
-              <w:left w:w="70" w:type="dxa"/>
-              <w:right w:w="70" w:type="dxa"/>
-            </w:tcMar>
-          </w:tcPr>
-          <w:p>
-            <w:r>
-              <w:rPr>
-                <w:rFonts w:ascii="Consolas" w:hAnsi="Consolas"/>
-                <w:b/>
-                <w:sz w:val="17"/>
-              </w:rPr>
-              <w:t>/api/history</w:t>
-            </w:r>
-          </w:p>
-        </w:tc>
-        <w:tc>
-          <w:tcPr>
-            <w:tcW w:type="dxa" w:w="2340"/>
-            <w:shd w:fill="FFFFFF"/>
-            <w:tcMar>
-              <w:top w:w="55" w:type="dxa"/>
-              <w:bottom w:w="55" w:type="dxa"/>
-              <w:left w:w="70" w:type="dxa"/>
-              <w:right w:w="70" w:type="dxa"/>
-            </w:tcMar>
-          </w:tcPr>
-          <w:p>
-            <w:r>
-              <w:rPr>
-                <w:sz w:val="17"/>
-              </w:rPr>
-              <w:t>?limit=50&amp;offset=0</w:t>
-            </w:r>
-          </w:p>
-        </w:tc>
-        <w:tc>
-          <w:tcPr>
-            <w:tcW w:type="dxa" w:w="2340"/>
-            <w:shd w:fill="FFFFFF"/>
-            <w:tcMar>
-              <w:top w:w="55" w:type="dxa"/>
-              <w:bottom w:w="55" w:type="dxa"/>
-              <w:left w:w="70" w:type="dxa"/>
-              <w:right w:w="70" w:type="dxa"/>
-            </w:tcMar>
-          </w:tcPr>
-          <w:p>
-            <w:r>
-              <w:rPr>
-                <w:sz w:val="17"/>
-              </w:rPr>
-              <w:t>Retrieves timestamped conversion logs from SQLite database</w:t>
-            </w:r>
-          </w:p>
-        </w:tc>
-      </w:tr>
-      <w:tr>
-        <w:tc>
-          <w:tcPr>
-            <w:tcW w:type="dxa" w:w="2340"/>
-            <w:shd w:fill="F8FAFC"/>
-            <w:tcMar>
-              <w:top w:w="55" w:type="dxa"/>
-              <w:bottom w:w="55" w:type="dxa"/>
-              <w:left w:w="70" w:type="dxa"/>
-              <w:right w:w="70" w:type="dxa"/>
-            </w:tcMar>
-          </w:tcPr>
-          <w:p>
-            <w:r>
-              <w:rPr>
-                <w:rFonts w:ascii="Consolas" w:hAnsi="Consolas"/>
-                <w:b/>
-                <w:sz w:val="17"/>
-              </w:rPr>
-              <w:t>DELETE</w:t>
-            </w:r>
-          </w:p>
-        </w:tc>
-        <w:tc>
-          <w:tcPr>
-            <w:tcW w:type="dxa" w:w="2340"/>
-            <w:shd w:fill="F8FAFC"/>
-            <w:tcMar>
-              <w:top w:w="55" w:type="dxa"/>
-              <w:bottom w:w="55" w:type="dxa"/>
-              <w:left w:w="70" w:type="dxa"/>
-              <w:right w:w="70" w:type="dxa"/>
-            </w:tcMar>
-          </w:tcPr>
-          <w:p>
-            <w:r>
-              <w:rPr>
-                <w:rFonts w:ascii="Consolas" w:hAnsi="Consolas"/>
-                <w:b/>
-                <w:sz w:val="17"/>
-              </w:rPr>
-              <w:t>/api/history</w:t>
-            </w:r>
-          </w:p>
-        </w:tc>
-        <w:tc>
-          <w:tcPr>
-            <w:tcW w:type="dxa" w:w="2340"/>
-            <w:shd w:fill="F8FAFC"/>
-            <w:tcMar>
-              <w:top w:w="55" w:type="dxa"/>
-              <w:bottom w:w="55" w:type="dxa"/>
-              <w:left w:w="70" w:type="dxa"/>
-              <w:right w:w="70" w:type="dxa"/>
-            </w:tcMar>
-          </w:tcPr>
-          <w:p>
-            <w:r>
-              <w:rPr>
-                <w:sz w:val="17"/>
-              </w:rPr>
-              <w:t>None</w:t>
-            </w:r>
-          </w:p>
-        </w:tc>
-        <w:tc>
-          <w:tcPr>
-            <w:tcW w:type="dxa" w:w="2340"/>
-            <w:shd w:fill="F8FAFC"/>
-            <w:tcMar>
-              <w:top w:w="55" w:type="dxa"/>
-              <w:bottom w:w="55" w:type="dxa"/>
-              <w:left w:w="70" w:type="dxa"/>
-              <w:right w:w="70" w:type="dxa"/>
-            </w:tcMar>
-          </w:tcPr>
-          <w:p>
-            <w:r>
-              <w:rPr>
-                <w:sz w:val="17"/>
-              </w:rPr>
-              <w:t>Purges database conversion records and reclaims storage via VACUUM</w:t>
-            </w:r>
-          </w:p>
-        </w:tc>
-      </w:tr>
-      <w:tr>
-        <w:tc>
-          <w:tcPr>
-            <w:tcW w:type="dxa" w:w="2340"/>
-            <w:shd w:fill="FFFFFF"/>
-            <w:tcMar>
-              <w:top w:w="55" w:type="dxa"/>
-              <w:bottom w:w="55" w:type="dxa"/>
-              <w:left w:w="70" w:type="dxa"/>
-              <w:right w:w="70" w:type="dxa"/>
-            </w:tcMar>
-          </w:tcPr>
-          <w:p>
-            <w:r>
-              <w:rPr>
-                <w:rFonts w:ascii="Consolas" w:hAnsi="Consolas"/>
-                <w:b/>
-                <w:sz w:val="17"/>
-              </w:rPr>
-              <w:t>GET</w:t>
-            </w:r>
-          </w:p>
-        </w:tc>
-        <w:tc>
-          <w:tcPr>
-            <w:tcW w:type="dxa" w:w="2340"/>
-            <w:shd w:fill="FFFFFF"/>
-            <w:tcMar>
-              <w:top w:w="55" w:type="dxa"/>
-              <w:bottom w:w="55" w:type="dxa"/>
-              <w:left w:w="70" w:type="dxa"/>
-              <w:right w:w="70" w:type="dxa"/>
-            </w:tcMar>
-          </w:tcPr>
-          <w:p>
-            <w:r>
-              <w:rPr>
-                <w:rFonts w:ascii="Consolas" w:hAnsi="Consolas"/>
-                <w:b/>
-                <w:sz w:val="17"/>
-              </w:rPr>
-              <w:t>/api/stats</w:t>
-            </w:r>
-          </w:p>
-        </w:tc>
-        <w:tc>
-          <w:tcPr>
-            <w:tcW w:type="dxa" w:w="2340"/>
-            <w:shd w:fill="FFFFFF"/>
-            <w:tcMar>
-              <w:top w:w="55" w:type="dxa"/>
-              <w:bottom w:w="55" w:type="dxa"/>
-              <w:left w:w="70" w:type="dxa"/>
-              <w:right w:w="70" w:type="dxa"/>
-            </w:tcMar>
-          </w:tcPr>
-          <w:p>
-            <w:r>
-              <w:rPr>
-                <w:sz w:val="17"/>
-              </w:rPr>
-              <w:t>None</w:t>
-            </w:r>
-          </w:p>
-        </w:tc>
-        <w:tc>
-          <w:tcPr>
-            <w:tcW w:type="dxa" w:w="2340"/>
-            <w:shd w:fill="FFFFFF"/>
-            <w:tcMar>
-              <w:top w:w="55" w:type="dxa"/>
-              <w:bottom w:w="55" w:type="dxa"/>
-              <w:left w:w="70" w:type="dxa"/>
-              <w:right w:w="70" w:type="dxa"/>
-            </w:tcMar>
-          </w:tcPr>
-          <w:p>
-            <w:r>
-              <w:rPr>
-                <w:sz w:val="17"/>
-              </w:rPr>
-              <w:t>Returns total conversions count, most frequent scales, and recorded extremes</w:t>
-            </w:r>
-          </w:p>
-        </w:tc>
-      </w:tr>
-      <w:tr>
-        <w:tc>
-          <w:tcPr>
-            <w:tcW w:type="dxa" w:w="2340"/>
-            <w:shd w:fill="F8FAFC"/>
-            <w:tcMar>
-              <w:top w:w="55" w:type="dxa"/>
-              <w:bottom w:w="55" w:type="dxa"/>
-              <w:left w:w="70" w:type="dxa"/>
-              <w:right w:w="70" w:type="dxa"/>
-            </w:tcMar>
-          </w:tcPr>
-          <w:p>
-            <w:r>
-              <w:rPr>
-                <w:rFonts w:ascii="Consolas" w:hAnsi="Consolas"/>
-                <w:b/>
-                <w:sz w:val="17"/>
-              </w:rPr>
-              <w:t>GET</w:t>
-            </w:r>
-          </w:p>
-        </w:tc>
-        <w:tc>
-          <w:tcPr>
-            <w:tcW w:type="dxa" w:w="2340"/>
-            <w:shd w:fill="F8FAFC"/>
-            <w:tcMar>
-              <w:top w:w="55" w:type="dxa"/>
-              <w:bottom w:w="55" w:type="dxa"/>
-              <w:left w:w="70" w:type="dxa"/>
-              <w:right w:w="70" w:type="dxa"/>
-            </w:tcMar>
-          </w:tcPr>
-          <w:p>
-            <w:r>
-              <w:rPr>
-                <w:rFonts w:ascii="Consolas" w:hAnsi="Consolas"/>
-                <w:b/>
-                <w:sz w:val="17"/>
-              </w:rPr>
-              <w:t>/api/export/csv</w:t>
-            </w:r>
-          </w:p>
-        </w:tc>
-        <w:tc>
-          <w:tcPr>
-            <w:tcW w:type="dxa" w:w="2340"/>
-            <w:shd w:fill="F8FAFC"/>
-            <w:tcMar>
-              <w:top w:w="55" w:type="dxa"/>
-              <w:bottom w:w="55" w:type="dxa"/>
-              <w:left w:w="70" w:type="dxa"/>
-              <w:right w:w="70" w:type="dxa"/>
-            </w:tcMar>
-          </w:tcPr>
-          <w:p>
-            <w:r>
-              <w:rPr>
-                <w:sz w:val="17"/>
-              </w:rPr>
-              <w:t>None</w:t>
-            </w:r>
-          </w:p>
-        </w:tc>
-        <w:tc>
-          <w:tcPr>
-            <w:tcW w:type="dxa" w:w="2340"/>
-            <w:shd w:fill="F8FAFC"/>
-            <w:tcMar>
-              <w:top w:w="55" w:type="dxa"/>
-              <w:bottom w:w="55" w:type="dxa"/>
-              <w:left w:w="70" w:type="dxa"/>
-              <w:right w:w="70" w:type="dxa"/>
-            </w:tcMar>
-          </w:tcPr>
-          <w:p>
-            <w:r>
-              <w:rPr>
-                <w:sz w:val="17"/>
-              </w:rPr>
-              <w:t>Streams conversion history as a downloadable CSV spreadsheet file</w:t>
-            </w:r>
-          </w:p>
-        </w:tc>
-      </w:tr>
-      <w:tr>
-        <w:tc>
-          <w:tcPr>
-            <w:tcW w:type="dxa" w:w="2340"/>
-            <w:shd w:fill="FFFFFF"/>
-            <w:tcMar>
-              <w:top w:w="55" w:type="dxa"/>
-              <w:bottom w:w="55" w:type="dxa"/>
-              <w:left w:w="70" w:type="dxa"/>
-              <w:right w:w="70" w:type="dxa"/>
-            </w:tcMar>
-          </w:tcPr>
-          <w:p>
-            <w:r>
-              <w:rPr>
-                <w:rFonts w:ascii="Consolas" w:hAnsi="Consolas"/>
-                <w:b/>
-                <w:sz w:val="17"/>
-              </w:rPr>
-              <w:t>GET</w:t>
-            </w:r>
-          </w:p>
-        </w:tc>
-        <w:tc>
-          <w:tcPr>
-            <w:tcW w:type="dxa" w:w="2340"/>
-            <w:shd w:fill="FFFFFF"/>
-            <w:tcMar>
-              <w:top w:w="55" w:type="dxa"/>
-              <w:bottom w:w="55" w:type="dxa"/>
-              <w:left w:w="70" w:type="dxa"/>
-              <w:right w:w="70" w:type="dxa"/>
+              <w:top w:w="45" w:type="dxa"/>
+              <w:bottom w:w="45" w:type="dxa"/>
+              <w:left w:w="65" w:type="dxa"/>
+              <w:right w:w="65" w:type="dxa"/>
             </w:tcMar>
           </w:tcPr>
           <w:p>
@@ -2202,13 +2465,13 @@
         </w:tc>
         <w:tc>
           <w:tcPr>
-            <w:tcW w:type="dxa" w:w="2340"/>
+            <w:tcW w:type="dxa" w:w="2448"/>
             <w:shd w:fill="FFFFFF"/>
             <w:tcMar>
-              <w:top w:w="55" w:type="dxa"/>
-              <w:bottom w:w="55" w:type="dxa"/>
-              <w:left w:w="70" w:type="dxa"/>
-              <w:right w:w="70" w:type="dxa"/>
+              <w:top w:w="45" w:type="dxa"/>
+              <w:bottom w:w="45" w:type="dxa"/>
+              <w:left w:w="65" w:type="dxa"/>
+              <w:right w:w="65" w:type="dxa"/>
             </w:tcMar>
           </w:tcPr>
           <w:p>
@@ -2222,13 +2485,13 @@
         </w:tc>
         <w:tc>
           <w:tcPr>
-            <w:tcW w:type="dxa" w:w="2340"/>
+            <w:tcW w:type="dxa" w:w="3744"/>
             <w:shd w:fill="FFFFFF"/>
             <w:tcMar>
-              <w:top w:w="55" w:type="dxa"/>
-              <w:bottom w:w="55" w:type="dxa"/>
-              <w:left w:w="70" w:type="dxa"/>
-              <w:right w:w="70" w:type="dxa"/>
+              <w:top w:w="45" w:type="dxa"/>
+              <w:bottom w:w="45" w:type="dxa"/>
+              <w:left w:w="65" w:type="dxa"/>
+              <w:right w:w="65" w:type="dxa"/>
             </w:tcMar>
           </w:tcPr>
           <w:p>
@@ -2246,6 +2509,11 @@
       <w:pPr>
         <w:spacing w:after="160"/>
       </w:pPr>
+    </w:p>
+    <w:p>
+      <w:r>
+        <w:br w:type="page"/>
+      </w:r>
     </w:p>
     <w:p>
       <w:pPr>
@@ -2284,7 +2552,7 @@
       <w:r>
         <w:drawing>
           <wp:inline xmlns:a="http://schemas.openxmlformats.org/drawingml/2006/main" xmlns:pic="http://schemas.openxmlformats.org/drawingml/2006/picture">
-            <wp:extent cx="5669280" cy="3543300"/>
+            <wp:extent cx="5303520" cy="3314700"/>
             <wp:docPr id="3" name="Picture 3"/>
             <wp:cNvGraphicFramePr>
               <a:graphicFrameLocks noChangeAspect="1"/>
@@ -2305,7 +2573,7 @@
                   <pic:spPr>
                     <a:xfrm>
                       <a:off x="0" y="0"/>
-                      <a:ext cx="5669280" cy="3543300"/>
+                      <a:ext cx="5303520" cy="3314700"/>
                     </a:xfrm>
                     <a:prstGeom prst="rect"/>
                   </pic:spPr>
@@ -2470,7 +2738,7 @@
       <w:r>
         <w:drawing>
           <wp:inline xmlns:a="http://schemas.openxmlformats.org/drawingml/2006/main" xmlns:pic="http://schemas.openxmlformats.org/drawingml/2006/picture">
-            <wp:extent cx="5669280" cy="3188970"/>
+            <wp:extent cx="5303520" cy="2983230"/>
             <wp:docPr id="4" name="Picture 4"/>
             <wp:cNvGraphicFramePr>
               <a:graphicFrameLocks noChangeAspect="1"/>
@@ -2491,7 +2759,7 @@
                   <pic:spPr>
                     <a:xfrm>
                       <a:off x="0" y="0"/>
-                      <a:ext cx="5669280" cy="3188970"/>
+                      <a:ext cx="5303520" cy="2983230"/>
                     </a:xfrm>
                     <a:prstGeom prst="rect"/>
                   </pic:spPr>
@@ -2517,6 +2785,11 @@
       </w:r>
     </w:p>
     <w:p>
+      <w:r>
+        <w:br w:type="page"/>
+      </w:r>
+    </w:p>
+    <w:p>
       <w:pPr>
         <w:keepNext/>
         <w:spacing w:before="360" w:after="120"/>
@@ -2533,13 +2806,14 @@
     </w:p>
     <w:p>
       <w:pPr>
+        <w:keepNext/>
         <w:spacing w:after="120" w:line="276" w:lineRule="auto"/>
       </w:pPr>
       <w:r>
         <w:rPr>
           <w:color w:val="374151"/>
         </w:rPr>
-        <w:t>A rigorous automated test suite was constructed in tests/backend.test.js covering all layers of the software system. All 43 test assertions executed with a 100% pass rate.</w:t>
+        <w:t>A rigorous automated test suite was constructed in tests/backend.test.js covering all layers of the software system. Table 3 presents the verification breakdown where all 43 assertions passed with 100% success:</w:t>
       </w:r>
     </w:p>
     <w:tbl>
@@ -2555,18 +2829,25 @@
         <w:gridCol w:w="2340"/>
       </w:tblGrid>
       <w:tr>
+        <w:trPr>
+          <w:cantSplit/>
+          <w:tblHeader/>
+        </w:trPr>
         <w:tc>
           <w:tcPr>
-            <w:tcW w:type="dxa" w:w="2340"/>
+            <w:tcW w:type="dxa" w:w="2592"/>
             <w:shd w:fill="1E3A8A"/>
             <w:tcMar>
-              <w:top w:w="70" w:type="dxa"/>
-              <w:bottom w:w="70" w:type="dxa"/>
-              <w:left w:w="80" w:type="dxa"/>
-              <w:right w:w="80" w:type="dxa"/>
+              <w:top w:w="60" w:type="dxa"/>
+              <w:bottom w:w="60" w:type="dxa"/>
+              <w:left w:w="75" w:type="dxa"/>
+              <w:right w:w="75" w:type="dxa"/>
             </w:tcMar>
           </w:tcPr>
           <w:p>
+            <w:pPr>
+              <w:keepNext/>
+            </w:pPr>
             <w:r>
               <w:rPr>
                 <w:b/>
@@ -2579,16 +2860,19 @@
         </w:tc>
         <w:tc>
           <w:tcPr>
-            <w:tcW w:type="dxa" w:w="2340"/>
+            <w:tcW w:type="dxa" w:w="2592"/>
             <w:shd w:fill="1E3A8A"/>
             <w:tcMar>
-              <w:top w:w="70" w:type="dxa"/>
-              <w:bottom w:w="70" w:type="dxa"/>
-              <w:left w:w="80" w:type="dxa"/>
-              <w:right w:w="80" w:type="dxa"/>
+              <w:top w:w="60" w:type="dxa"/>
+              <w:bottom w:w="60" w:type="dxa"/>
+              <w:left w:w="75" w:type="dxa"/>
+              <w:right w:w="75" w:type="dxa"/>
             </w:tcMar>
           </w:tcPr>
           <w:p>
+            <w:pPr>
+              <w:keepNext/>
+            </w:pPr>
             <w:r>
               <w:rPr>
                 <w:b/>
@@ -2601,16 +2885,19 @@
         </w:tc>
         <w:tc>
           <w:tcPr>
-            <w:tcW w:type="dxa" w:w="2340"/>
+            <w:tcW w:type="dxa" w:w="2160"/>
             <w:shd w:fill="1E3A8A"/>
             <w:tcMar>
-              <w:top w:w="70" w:type="dxa"/>
-              <w:bottom w:w="70" w:type="dxa"/>
-              <w:left w:w="80" w:type="dxa"/>
-              <w:right w:w="80" w:type="dxa"/>
+              <w:top w:w="60" w:type="dxa"/>
+              <w:bottom w:w="60" w:type="dxa"/>
+              <w:left w:w="75" w:type="dxa"/>
+              <w:right w:w="75" w:type="dxa"/>
             </w:tcMar>
           </w:tcPr>
           <w:p>
+            <w:pPr>
+              <w:keepNext/>
+            </w:pPr>
             <w:r>
               <w:rPr>
                 <w:b/>
@@ -2623,16 +2910,19 @@
         </w:tc>
         <w:tc>
           <w:tcPr>
-            <w:tcW w:type="dxa" w:w="2340"/>
+            <w:tcW w:type="dxa" w:w="2016"/>
             <w:shd w:fill="1E3A8A"/>
             <w:tcMar>
-              <w:top w:w="70" w:type="dxa"/>
-              <w:bottom w:w="70" w:type="dxa"/>
-              <w:left w:w="80" w:type="dxa"/>
-              <w:right w:w="80" w:type="dxa"/>
+              <w:top w:w="60" w:type="dxa"/>
+              <w:bottom w:w="60" w:type="dxa"/>
+              <w:left w:w="75" w:type="dxa"/>
+              <w:right w:w="75" w:type="dxa"/>
             </w:tcMar>
           </w:tcPr>
           <w:p>
+            <w:pPr>
+              <w:keepNext/>
+            </w:pPr>
             <w:r>
               <w:rPr>
                 <w:b/>
@@ -2645,18 +2935,24 @@
         </w:tc>
       </w:tr>
       <w:tr>
+        <w:trPr>
+          <w:cantSplit/>
+        </w:trPr>
         <w:tc>
           <w:tcPr>
-            <w:tcW w:type="dxa" w:w="2340"/>
+            <w:tcW w:type="dxa" w:w="2592"/>
             <w:shd w:fill="F8FAFC"/>
             <w:tcMar>
-              <w:top w:w="55" w:type="dxa"/>
-              <w:bottom w:w="55" w:type="dxa"/>
-              <w:left w:w="80" w:type="dxa"/>
-              <w:right w:w="80" w:type="dxa"/>
+              <w:top w:w="45" w:type="dxa"/>
+              <w:bottom w:w="45" w:type="dxa"/>
+              <w:left w:w="75" w:type="dxa"/>
+              <w:right w:w="75" w:type="dxa"/>
             </w:tcMar>
           </w:tcPr>
           <w:p>
+            <w:pPr>
+              <w:keepNext/>
+            </w:pPr>
             <w:r>
               <w:rPr>
                 <w:sz w:val="17"/>
@@ -2667,16 +2963,19 @@
         </w:tc>
         <w:tc>
           <w:tcPr>
-            <w:tcW w:type="dxa" w:w="2340"/>
+            <w:tcW w:type="dxa" w:w="2592"/>
             <w:shd w:fill="F8FAFC"/>
             <w:tcMar>
-              <w:top w:w="55" w:type="dxa"/>
-              <w:bottom w:w="55" w:type="dxa"/>
-              <w:left w:w="80" w:type="dxa"/>
-              <w:right w:w="80" w:type="dxa"/>
+              <w:top w:w="45" w:type="dxa"/>
+              <w:bottom w:w="45" w:type="dxa"/>
+              <w:left w:w="75" w:type="dxa"/>
+              <w:right w:w="75" w:type="dxa"/>
             </w:tcMar>
           </w:tcPr>
           <w:p>
+            <w:pPr>
+              <w:keepNext/>
+            </w:pPr>
             <w:r>
               <w:rPr>
                 <w:sz w:val="17"/>
@@ -2687,16 +2986,19 @@
         </w:tc>
         <w:tc>
           <w:tcPr>
-            <w:tcW w:type="dxa" w:w="2340"/>
+            <w:tcW w:type="dxa" w:w="2160"/>
             <w:shd w:fill="F8FAFC"/>
             <w:tcMar>
-              <w:top w:w="55" w:type="dxa"/>
-              <w:bottom w:w="55" w:type="dxa"/>
-              <w:left w:w="80" w:type="dxa"/>
-              <w:right w:w="80" w:type="dxa"/>
+              <w:top w:w="45" w:type="dxa"/>
+              <w:bottom w:w="45" w:type="dxa"/>
+              <w:left w:w="75" w:type="dxa"/>
+              <w:right w:w="75" w:type="dxa"/>
             </w:tcMar>
           </w:tcPr>
           <w:p>
+            <w:pPr>
+              <w:keepNext/>
+            </w:pPr>
             <w:r>
               <w:rPr>
                 <w:sz w:val="17"/>
@@ -2707,16 +3009,19 @@
         </w:tc>
         <w:tc>
           <w:tcPr>
-            <w:tcW w:type="dxa" w:w="2340"/>
+            <w:tcW w:type="dxa" w:w="2016"/>
             <w:shd w:fill="F8FAFC"/>
             <w:tcMar>
-              <w:top w:w="55" w:type="dxa"/>
-              <w:bottom w:w="55" w:type="dxa"/>
-              <w:left w:w="80" w:type="dxa"/>
-              <w:right w:w="80" w:type="dxa"/>
+              <w:top w:w="45" w:type="dxa"/>
+              <w:bottom w:w="45" w:type="dxa"/>
+              <w:left w:w="75" w:type="dxa"/>
+              <w:right w:w="75" w:type="dxa"/>
             </w:tcMar>
           </w:tcPr>
           <w:p>
+            <w:pPr>
+              <w:keepNext/>
+            </w:pPr>
             <w:r>
               <w:rPr>
                 <w:b/>
@@ -2729,18 +3034,24 @@
         </w:tc>
       </w:tr>
       <w:tr>
+        <w:trPr>
+          <w:cantSplit/>
+        </w:trPr>
         <w:tc>
           <w:tcPr>
-            <w:tcW w:type="dxa" w:w="2340"/>
+            <w:tcW w:type="dxa" w:w="2592"/>
             <w:shd w:fill="FFFFFF"/>
             <w:tcMar>
-              <w:top w:w="55" w:type="dxa"/>
-              <w:bottom w:w="55" w:type="dxa"/>
-              <w:left w:w="80" w:type="dxa"/>
-              <w:right w:w="80" w:type="dxa"/>
+              <w:top w:w="45" w:type="dxa"/>
+              <w:bottom w:w="45" w:type="dxa"/>
+              <w:left w:w="75" w:type="dxa"/>
+              <w:right w:w="75" w:type="dxa"/>
             </w:tcMar>
           </w:tcPr>
           <w:p>
+            <w:pPr>
+              <w:keepNext/>
+            </w:pPr>
             <w:r>
               <w:rPr>
                 <w:sz w:val="17"/>
@@ -2751,16 +3062,19 @@
         </w:tc>
         <w:tc>
           <w:tcPr>
-            <w:tcW w:type="dxa" w:w="2340"/>
+            <w:tcW w:type="dxa" w:w="2592"/>
             <w:shd w:fill="FFFFFF"/>
             <w:tcMar>
-              <w:top w:w="55" w:type="dxa"/>
-              <w:bottom w:w="55" w:type="dxa"/>
-              <w:left w:w="80" w:type="dxa"/>
-              <w:right w:w="80" w:type="dxa"/>
+              <w:top w:w="45" w:type="dxa"/>
+              <w:bottom w:w="45" w:type="dxa"/>
+              <w:left w:w="75" w:type="dxa"/>
+              <w:right w:w="75" w:type="dxa"/>
             </w:tcMar>
           </w:tcPr>
           <w:p>
+            <w:pPr>
+              <w:keepNext/>
+            </w:pPr>
             <w:r>
               <w:rPr>
                 <w:sz w:val="17"/>
@@ -2771,16 +3085,19 @@
         </w:tc>
         <w:tc>
           <w:tcPr>
-            <w:tcW w:type="dxa" w:w="2340"/>
+            <w:tcW w:type="dxa" w:w="2160"/>
             <w:shd w:fill="FFFFFF"/>
             <w:tcMar>
-              <w:top w:w="55" w:type="dxa"/>
-              <w:bottom w:w="55" w:type="dxa"/>
-              <w:left w:w="80" w:type="dxa"/>
-              <w:right w:w="80" w:type="dxa"/>
+              <w:top w:w="45" w:type="dxa"/>
+              <w:bottom w:w="45" w:type="dxa"/>
+              <w:left w:w="75" w:type="dxa"/>
+              <w:right w:w="75" w:type="dxa"/>
             </w:tcMar>
           </w:tcPr>
           <w:p>
+            <w:pPr>
+              <w:keepNext/>
+            </w:pPr>
             <w:r>
               <w:rPr>
                 <w:sz w:val="17"/>
@@ -2791,16 +3108,19 @@
         </w:tc>
         <w:tc>
           <w:tcPr>
-            <w:tcW w:type="dxa" w:w="2340"/>
+            <w:tcW w:type="dxa" w:w="2016"/>
             <w:shd w:fill="FFFFFF"/>
             <w:tcMar>
-              <w:top w:w="55" w:type="dxa"/>
-              <w:bottom w:w="55" w:type="dxa"/>
-              <w:left w:w="80" w:type="dxa"/>
-              <w:right w:w="80" w:type="dxa"/>
+              <w:top w:w="45" w:type="dxa"/>
+              <w:bottom w:w="45" w:type="dxa"/>
+              <w:left w:w="75" w:type="dxa"/>
+              <w:right w:w="75" w:type="dxa"/>
             </w:tcMar>
           </w:tcPr>
           <w:p>
+            <w:pPr>
+              <w:keepNext/>
+            </w:pPr>
             <w:r>
               <w:rPr>
                 <w:b/>
@@ -2813,18 +3133,24 @@
         </w:tc>
       </w:tr>
       <w:tr>
+        <w:trPr>
+          <w:cantSplit/>
+        </w:trPr>
         <w:tc>
           <w:tcPr>
-            <w:tcW w:type="dxa" w:w="2340"/>
+            <w:tcW w:type="dxa" w:w="2592"/>
             <w:shd w:fill="F8FAFC"/>
             <w:tcMar>
-              <w:top w:w="55" w:type="dxa"/>
-              <w:bottom w:w="55" w:type="dxa"/>
-              <w:left w:w="80" w:type="dxa"/>
-              <w:right w:w="80" w:type="dxa"/>
+              <w:top w:w="45" w:type="dxa"/>
+              <w:bottom w:w="45" w:type="dxa"/>
+              <w:left w:w="75" w:type="dxa"/>
+              <w:right w:w="75" w:type="dxa"/>
             </w:tcMar>
           </w:tcPr>
           <w:p>
+            <w:pPr>
+              <w:keepNext/>
+            </w:pPr>
             <w:r>
               <w:rPr>
                 <w:sz w:val="17"/>
@@ -2835,16 +3161,19 @@
         </w:tc>
         <w:tc>
           <w:tcPr>
-            <w:tcW w:type="dxa" w:w="2340"/>
+            <w:tcW w:type="dxa" w:w="2592"/>
             <w:shd w:fill="F8FAFC"/>
             <w:tcMar>
-              <w:top w:w="55" w:type="dxa"/>
-              <w:bottom w:w="55" w:type="dxa"/>
-              <w:left w:w="80" w:type="dxa"/>
-              <w:right w:w="80" w:type="dxa"/>
+              <w:top w:w="45" w:type="dxa"/>
+              <w:bottom w:w="45" w:type="dxa"/>
+              <w:left w:w="75" w:type="dxa"/>
+              <w:right w:w="75" w:type="dxa"/>
             </w:tcMar>
           </w:tcPr>
           <w:p>
+            <w:pPr>
+              <w:keepNext/>
+            </w:pPr>
             <w:r>
               <w:rPr>
                 <w:sz w:val="17"/>
@@ -2855,16 +3184,19 @@
         </w:tc>
         <w:tc>
           <w:tcPr>
-            <w:tcW w:type="dxa" w:w="2340"/>
+            <w:tcW w:type="dxa" w:w="2160"/>
             <w:shd w:fill="F8FAFC"/>
             <w:tcMar>
-              <w:top w:w="55" w:type="dxa"/>
-              <w:bottom w:w="55" w:type="dxa"/>
-              <w:left w:w="80" w:type="dxa"/>
-              <w:right w:w="80" w:type="dxa"/>
+              <w:top w:w="45" w:type="dxa"/>
+              <w:bottom w:w="45" w:type="dxa"/>
+              <w:left w:w="75" w:type="dxa"/>
+              <w:right w:w="75" w:type="dxa"/>
             </w:tcMar>
           </w:tcPr>
           <w:p>
+            <w:pPr>
+              <w:keepNext/>
+            </w:pPr>
             <w:r>
               <w:rPr>
                 <w:sz w:val="17"/>
@@ -2875,16 +3207,19 @@
         </w:tc>
         <w:tc>
           <w:tcPr>
-            <w:tcW w:type="dxa" w:w="2340"/>
+            <w:tcW w:type="dxa" w:w="2016"/>
             <w:shd w:fill="F8FAFC"/>
             <w:tcMar>
-              <w:top w:w="55" w:type="dxa"/>
-              <w:bottom w:w="55" w:type="dxa"/>
-              <w:left w:w="80" w:type="dxa"/>
-              <w:right w:w="80" w:type="dxa"/>
+              <w:top w:w="45" w:type="dxa"/>
+              <w:bottom w:w="45" w:type="dxa"/>
+              <w:left w:w="75" w:type="dxa"/>
+              <w:right w:w="75" w:type="dxa"/>
             </w:tcMar>
           </w:tcPr>
           <w:p>
+            <w:pPr>
+              <w:keepNext/>
+            </w:pPr>
             <w:r>
               <w:rPr>
                 <w:b/>
@@ -2897,18 +3232,24 @@
         </w:tc>
       </w:tr>
       <w:tr>
+        <w:trPr>
+          <w:cantSplit/>
+        </w:trPr>
         <w:tc>
           <w:tcPr>
-            <w:tcW w:type="dxa" w:w="2340"/>
+            <w:tcW w:type="dxa" w:w="2592"/>
             <w:shd w:fill="FFFFFF"/>
             <w:tcMar>
-              <w:top w:w="55" w:type="dxa"/>
-              <w:bottom w:w="55" w:type="dxa"/>
-              <w:left w:w="80" w:type="dxa"/>
-              <w:right w:w="80" w:type="dxa"/>
+              <w:top w:w="45" w:type="dxa"/>
+              <w:bottom w:w="45" w:type="dxa"/>
+              <w:left w:w="75" w:type="dxa"/>
+              <w:right w:w="75" w:type="dxa"/>
             </w:tcMar>
           </w:tcPr>
           <w:p>
+            <w:pPr>
+              <w:keepNext/>
+            </w:pPr>
             <w:r>
               <w:rPr>
                 <w:sz w:val="17"/>
@@ -2919,16 +3260,19 @@
         </w:tc>
         <w:tc>
           <w:tcPr>
-            <w:tcW w:type="dxa" w:w="2340"/>
+            <w:tcW w:type="dxa" w:w="2592"/>
             <w:shd w:fill="FFFFFF"/>
             <w:tcMar>
-              <w:top w:w="55" w:type="dxa"/>
-              <w:bottom w:w="55" w:type="dxa"/>
-              <w:left w:w="80" w:type="dxa"/>
-              <w:right w:w="80" w:type="dxa"/>
+              <w:top w:w="45" w:type="dxa"/>
+              <w:bottom w:w="45" w:type="dxa"/>
+              <w:left w:w="75" w:type="dxa"/>
+              <w:right w:w="75" w:type="dxa"/>
             </w:tcMar>
           </w:tcPr>
           <w:p>
+            <w:pPr>
+              <w:keepNext/>
+            </w:pPr>
             <w:r>
               <w:rPr>
                 <w:sz w:val="17"/>
@@ -2939,16 +3283,19 @@
         </w:tc>
         <w:tc>
           <w:tcPr>
-            <w:tcW w:type="dxa" w:w="2340"/>
+            <w:tcW w:type="dxa" w:w="2160"/>
             <w:shd w:fill="FFFFFF"/>
             <w:tcMar>
-              <w:top w:w="55" w:type="dxa"/>
-              <w:bottom w:w="55" w:type="dxa"/>
-              <w:left w:w="80" w:type="dxa"/>
-              <w:right w:w="80" w:type="dxa"/>
+              <w:top w:w="45" w:type="dxa"/>
+              <w:bottom w:w="45" w:type="dxa"/>
+              <w:left w:w="75" w:type="dxa"/>
+              <w:right w:w="75" w:type="dxa"/>
             </w:tcMar>
           </w:tcPr>
           <w:p>
+            <w:pPr>
+              <w:keepNext/>
+            </w:pPr>
             <w:r>
               <w:rPr>
                 <w:sz w:val="17"/>
@@ -2959,16 +3306,19 @@
         </w:tc>
         <w:tc>
           <w:tcPr>
-            <w:tcW w:type="dxa" w:w="2340"/>
+            <w:tcW w:type="dxa" w:w="2016"/>
             <w:shd w:fill="FFFFFF"/>
             <w:tcMar>
-              <w:top w:w="55" w:type="dxa"/>
-              <w:bottom w:w="55" w:type="dxa"/>
-              <w:left w:w="80" w:type="dxa"/>
-              <w:right w:w="80" w:type="dxa"/>
+              <w:top w:w="45" w:type="dxa"/>
+              <w:bottom w:w="45" w:type="dxa"/>
+              <w:left w:w="75" w:type="dxa"/>
+              <w:right w:w="75" w:type="dxa"/>
             </w:tcMar>
           </w:tcPr>
           <w:p>
+            <w:pPr>
+              <w:keepNext/>
+            </w:pPr>
             <w:r>
               <w:rPr>
                 <w:b/>
@@ -2981,18 +3331,24 @@
         </w:tc>
       </w:tr>
       <w:tr>
+        <w:trPr>
+          <w:cantSplit/>
+        </w:trPr>
         <w:tc>
           <w:tcPr>
-            <w:tcW w:type="dxa" w:w="2340"/>
+            <w:tcW w:type="dxa" w:w="2592"/>
             <w:shd w:fill="F8FAFC"/>
             <w:tcMar>
-              <w:top w:w="55" w:type="dxa"/>
-              <w:bottom w:w="55" w:type="dxa"/>
-              <w:left w:w="80" w:type="dxa"/>
-              <w:right w:w="80" w:type="dxa"/>
+              <w:top w:w="45" w:type="dxa"/>
+              <w:bottom w:w="45" w:type="dxa"/>
+              <w:left w:w="75" w:type="dxa"/>
+              <w:right w:w="75" w:type="dxa"/>
             </w:tcMar>
           </w:tcPr>
           <w:p>
+            <w:pPr>
+              <w:keepNext/>
+            </w:pPr>
             <w:r>
               <w:rPr>
                 <w:sz w:val="17"/>
@@ -3003,16 +3359,19 @@
         </w:tc>
         <w:tc>
           <w:tcPr>
-            <w:tcW w:type="dxa" w:w="2340"/>
+            <w:tcW w:type="dxa" w:w="2592"/>
             <w:shd w:fill="F8FAFC"/>
             <w:tcMar>
-              <w:top w:w="55" w:type="dxa"/>
-              <w:bottom w:w="55" w:type="dxa"/>
-              <w:left w:w="80" w:type="dxa"/>
-              <w:right w:w="80" w:type="dxa"/>
+              <w:top w:w="45" w:type="dxa"/>
+              <w:bottom w:w="45" w:type="dxa"/>
+              <w:left w:w="75" w:type="dxa"/>
+              <w:right w:w="75" w:type="dxa"/>
             </w:tcMar>
           </w:tcPr>
           <w:p>
+            <w:pPr>
+              <w:keepNext/>
+            </w:pPr>
             <w:r>
               <w:rPr>
                 <w:sz w:val="17"/>
@@ -3023,16 +3382,19 @@
         </w:tc>
         <w:tc>
           <w:tcPr>
-            <w:tcW w:type="dxa" w:w="2340"/>
+            <w:tcW w:type="dxa" w:w="2160"/>
             <w:shd w:fill="F8FAFC"/>
             <w:tcMar>
-              <w:top w:w="55" w:type="dxa"/>
-              <w:bottom w:w="55" w:type="dxa"/>
-              <w:left w:w="80" w:type="dxa"/>
-              <w:right w:w="80" w:type="dxa"/>
+              <w:top w:w="45" w:type="dxa"/>
+              <w:bottom w:w="45" w:type="dxa"/>
+              <w:left w:w="75" w:type="dxa"/>
+              <w:right w:w="75" w:type="dxa"/>
             </w:tcMar>
           </w:tcPr>
           <w:p>
+            <w:pPr>
+              <w:keepNext/>
+            </w:pPr>
             <w:r>
               <w:rPr>
                 <w:sz w:val="17"/>
@@ -3043,16 +3405,19 @@
         </w:tc>
         <w:tc>
           <w:tcPr>
-            <w:tcW w:type="dxa" w:w="2340"/>
+            <w:tcW w:type="dxa" w:w="2016"/>
             <w:shd w:fill="F8FAFC"/>
             <w:tcMar>
-              <w:top w:w="55" w:type="dxa"/>
-              <w:bottom w:w="55" w:type="dxa"/>
-              <w:left w:w="80" w:type="dxa"/>
-              <w:right w:w="80" w:type="dxa"/>
+              <w:top w:w="45" w:type="dxa"/>
+              <w:bottom w:w="45" w:type="dxa"/>
+              <w:left w:w="75" w:type="dxa"/>
+              <w:right w:w="75" w:type="dxa"/>
             </w:tcMar>
           </w:tcPr>
           <w:p>
+            <w:pPr>
+              <w:keepNext/>
+            </w:pPr>
             <w:r>
               <w:rPr>
                 <w:b/>
@@ -3065,15 +3430,18 @@
         </w:tc>
       </w:tr>
       <w:tr>
+        <w:trPr>
+          <w:cantSplit/>
+        </w:trPr>
         <w:tc>
           <w:tcPr>
-            <w:tcW w:type="dxa" w:w="2340"/>
+            <w:tcW w:type="dxa" w:w="2592"/>
             <w:shd w:fill="FFFFFF"/>
             <w:tcMar>
-              <w:top w:w="55" w:type="dxa"/>
-              <w:bottom w:w="55" w:type="dxa"/>
-              <w:left w:w="80" w:type="dxa"/>
-              <w:right w:w="80" w:type="dxa"/>
+              <w:top w:w="45" w:type="dxa"/>
+              <w:bottom w:w="45" w:type="dxa"/>
+              <w:left w:w="75" w:type="dxa"/>
+              <w:right w:w="75" w:type="dxa"/>
             </w:tcMar>
           </w:tcPr>
           <w:p>
@@ -3087,13 +3455,13 @@
         </w:tc>
         <w:tc>
           <w:tcPr>
-            <w:tcW w:type="dxa" w:w="2340"/>
+            <w:tcW w:type="dxa" w:w="2592"/>
             <w:shd w:fill="FFFFFF"/>
             <w:tcMar>
-              <w:top w:w="55" w:type="dxa"/>
-              <w:bottom w:w="55" w:type="dxa"/>
-              <w:left w:w="80" w:type="dxa"/>
-              <w:right w:w="80" w:type="dxa"/>
+              <w:top w:w="45" w:type="dxa"/>
+              <w:bottom w:w="45" w:type="dxa"/>
+              <w:left w:w="75" w:type="dxa"/>
+              <w:right w:w="75" w:type="dxa"/>
             </w:tcMar>
           </w:tcPr>
           <w:p>
@@ -3107,13 +3475,13 @@
         </w:tc>
         <w:tc>
           <w:tcPr>
-            <w:tcW w:type="dxa" w:w="2340"/>
+            <w:tcW w:type="dxa" w:w="2160"/>
             <w:shd w:fill="FFFFFF"/>
             <w:tcMar>
-              <w:top w:w="55" w:type="dxa"/>
-              <w:bottom w:w="55" w:type="dxa"/>
-              <w:left w:w="80" w:type="dxa"/>
-              <w:right w:w="80" w:type="dxa"/>
+              <w:top w:w="45" w:type="dxa"/>
+              <w:bottom w:w="45" w:type="dxa"/>
+              <w:left w:w="75" w:type="dxa"/>
+              <w:right w:w="75" w:type="dxa"/>
             </w:tcMar>
           </w:tcPr>
           <w:p>
@@ -3127,13 +3495,13 @@
         </w:tc>
         <w:tc>
           <w:tcPr>
-            <w:tcW w:type="dxa" w:w="2340"/>
+            <w:tcW w:type="dxa" w:w="2016"/>
             <w:shd w:fill="FFFFFF"/>
             <w:tcMar>
-              <w:top w:w="55" w:type="dxa"/>
-              <w:bottom w:w="55" w:type="dxa"/>
-              <w:left w:w="80" w:type="dxa"/>
-              <w:right w:w="80" w:type="dxa"/>
+              <w:top w:w="45" w:type="dxa"/>
+              <w:bottom w:w="45" w:type="dxa"/>
+              <w:left w:w="75" w:type="dxa"/>
+              <w:right w:w="75" w:type="dxa"/>
             </w:tcMar>
           </w:tcPr>
           <w:p>

</xml_diff>